<commit_message>
improve image sharing+cache+statistical analysis
</commit_message>
<xml_diff>
--- a/StreetCheck_Data_Query_Help.docx
+++ b/StreetCheck_Data_Query_Help.docx
@@ -5,7 +5,6 @@
     <w:p>
       <w:pPr>
         <w:spacing w:after="120" w:before="120"/>
-        <w:jc w:val="left"/>
       </w:pPr>
       <w:r>
         <w:rPr>
@@ -21,7 +20,6 @@
     <w:p>
       <w:pPr>
         <w:spacing w:after="120"/>
-        <w:jc w:val="left"/>
       </w:pPr>
       <w:r>
         <w:rPr>
@@ -40,7 +38,6 @@
           <w:bottom w:val="single" w:color="00857A" w:sz="12" w:space="8"/>
         </w:pBdr>
         <w:spacing w:after="360"/>
-        <w:jc w:val="left"/>
       </w:pPr>
       <w:r>
         <w:rPr>
@@ -56,7 +53,7 @@
     <w:p>
       <w:pPr>
         <w:pStyle w:val="Heading1"/>
-        <w:spacing w:after="180" w:before="240"/>
+        <w:spacing w:after="180" w:before="360"/>
       </w:pPr>
       <w:r>
         <w:rPr>
@@ -99,7 +96,7 @@
           <w:sz w:val="22"/>
           <w:szCs w:val="22"/>
         </w:rPr>
-        <w:t xml:space="preserve">in the sidebar on the left side of the page. The tool will read it and show you a quick summary of how many samples are in your data.</w:t>
+        <w:t xml:space="preserve">in the sidebar on the left side of the page. The tool reads it and shows a quick summary of how many samples are in your data.</w:t>
       </w:r>
     </w:p>
     <w:p>
@@ -165,7 +162,7 @@
           <w:sz w:val="22"/>
           <w:szCs w:val="22"/>
         </w:rPr>
-        <w:t xml:space="preserve">The tool reads your data and replies with a written summary plus the right kind of visual — a chart, table, ranked list, or key numbers — that you can download as PNG, CSV, or Excel.</w:t>
+        <w:t xml:space="preserve">The tool replies with a written summary plus the right kind of visual — a chart, table, ranked list, or key numbers — that you can download in several formats.</w:t>
       </w:r>
     </w:p>
     <w:p>
@@ -173,7 +170,7 @@
         <w:pBdr>
           <w:left w:val="single" w:color="00857A" w:sz="24" w:space="12"/>
         </w:pBdr>
-        <w:spacing w:after="240" w:before="120" w:line="300"/>
+        <w:spacing w:after="200" w:before="100" w:line="300"/>
         <w:ind w:left="240"/>
       </w:pPr>
       <w:r>
@@ -184,7 +181,7 @@
           <w:sz w:val="22"/>
           <w:szCs w:val="22"/>
         </w:rPr>
-        <w:t xml:space="preserve">Tip: </w:t>
+        <w:t xml:space="preserve">Privacy: </w:t>
       </w:r>
       <w:r>
         <w:rPr>
@@ -198,7 +195,7 @@
     <w:p>
       <w:pPr>
         <w:pStyle w:val="Heading1"/>
-        <w:spacing w:after="180" w:before="240"/>
+        <w:spacing w:after="180" w:before="360"/>
       </w:pPr>
       <w:r>
         <w:rPr>
@@ -357,6 +354,8 @@
           <w:p>
             <w:r>
               <w:rPr>
+                <w:b w:val="false"/>
+                <w:bCs w:val="false"/>
                 <w:color w:val="1A2B3C"/>
                 <w:sz w:val="21"/>
                 <w:szCs w:val="21"/>
@@ -418,6 +417,8 @@
           <w:p>
             <w:r>
               <w:rPr>
+                <w:b w:val="false"/>
+                <w:bCs w:val="false"/>
                 <w:color w:val="1A2B3C"/>
                 <w:sz w:val="21"/>
                 <w:szCs w:val="21"/>
@@ -479,6 +480,8 @@
           <w:p>
             <w:r>
               <w:rPr>
+                <w:b w:val="false"/>
+                <w:bCs w:val="false"/>
                 <w:color w:val="1A2B3C"/>
                 <w:sz w:val="21"/>
                 <w:szCs w:val="21"/>
@@ -540,6 +543,8 @@
           <w:p>
             <w:r>
               <w:rPr>
+                <w:b w:val="false"/>
+                <w:bCs w:val="false"/>
                 <w:color w:val="1A2B3C"/>
                 <w:sz w:val="21"/>
                 <w:szCs w:val="21"/>
@@ -601,6 +606,8 @@
           <w:p>
             <w:r>
               <w:rPr>
+                <w:b w:val="false"/>
+                <w:bCs w:val="false"/>
                 <w:color w:val="1A2B3C"/>
                 <w:sz w:val="21"/>
                 <w:szCs w:val="21"/>
@@ -662,6 +669,8 @@
           <w:p>
             <w:r>
               <w:rPr>
+                <w:b w:val="false"/>
+                <w:bCs w:val="false"/>
                 <w:color w:val="1A2B3C"/>
                 <w:sz w:val="21"/>
                 <w:szCs w:val="21"/>
@@ -723,6 +732,8 @@
           <w:p>
             <w:r>
               <w:rPr>
+                <w:b w:val="false"/>
+                <w:bCs w:val="false"/>
                 <w:color w:val="1A2B3C"/>
                 <w:sz w:val="21"/>
                 <w:szCs w:val="21"/>
@@ -784,6 +795,8 @@
           <w:p>
             <w:r>
               <w:rPr>
+                <w:b w:val="false"/>
+                <w:bCs w:val="false"/>
                 <w:color w:val="1A2B3C"/>
                 <w:sz w:val="21"/>
                 <w:szCs w:val="21"/>
@@ -845,6 +858,8 @@
           <w:p>
             <w:r>
               <w:rPr>
+                <w:b w:val="false"/>
+                <w:bCs w:val="false"/>
                 <w:color w:val="1A2B3C"/>
                 <w:sz w:val="21"/>
                 <w:szCs w:val="21"/>
@@ -906,6 +921,8 @@
           <w:p>
             <w:r>
               <w:rPr>
+                <w:b w:val="false"/>
+                <w:bCs w:val="false"/>
                 <w:color w:val="1A2B3C"/>
                 <w:sz w:val="21"/>
                 <w:szCs w:val="21"/>
@@ -967,6 +984,8 @@
           <w:p>
             <w:r>
               <w:rPr>
+                <w:b w:val="false"/>
+                <w:bCs w:val="false"/>
                 <w:color w:val="1A2B3C"/>
                 <w:sz w:val="21"/>
                 <w:szCs w:val="21"/>
@@ -1028,6 +1047,8 @@
           <w:p>
             <w:r>
               <w:rPr>
+                <w:b w:val="false"/>
+                <w:bCs w:val="false"/>
                 <w:color w:val="1A2B3C"/>
                 <w:sz w:val="21"/>
                 <w:szCs w:val="21"/>
@@ -1089,6 +1110,8 @@
           <w:p>
             <w:r>
               <w:rPr>
+                <w:b w:val="false"/>
+                <w:bCs w:val="false"/>
                 <w:color w:val="1A2B3C"/>
                 <w:sz w:val="21"/>
                 <w:szCs w:val="21"/>
@@ -1150,11 +1173,13 @@
           <w:p>
             <w:r>
               <w:rPr>
-                <w:color w:val="1A2B3C"/>
-                <w:sz w:val="21"/>
-                <w:szCs w:val="21"/>
-              </w:rPr>
-              <w:t xml:space="preserve">Standardized version of the submitter's guess</w:t>
+                <w:b w:val="false"/>
+                <w:bCs w:val="false"/>
+                <w:color w:val="1A2B3C"/>
+                <w:sz w:val="21"/>
+                <w:szCs w:val="21"/>
+              </w:rPr>
+              <w:t xml:space="preserve">Standardized version of the submitter’s guess</w:t>
             </w:r>
           </w:p>
         </w:tc>
@@ -1211,6 +1236,8 @@
           <w:p>
             <w:r>
               <w:rPr>
+                <w:b w:val="false"/>
+                <w:bCs w:val="false"/>
                 <w:color w:val="1A2B3C"/>
                 <w:sz w:val="21"/>
                 <w:szCs w:val="21"/>
@@ -1272,6 +1299,8 @@
           <w:p>
             <w:r>
               <w:rPr>
+                <w:b w:val="false"/>
+                <w:bCs w:val="false"/>
                 <w:color w:val="1A2B3C"/>
                 <w:sz w:val="21"/>
                 <w:szCs w:val="21"/>
@@ -1333,6 +1362,8 @@
           <w:p>
             <w:r>
               <w:rPr>
+                <w:b w:val="false"/>
+                <w:bCs w:val="false"/>
                 <w:color w:val="1A2B3C"/>
                 <w:sz w:val="21"/>
                 <w:szCs w:val="21"/>
@@ -1371,7 +1402,7 @@
     <w:p>
       <w:pPr>
         <w:pStyle w:val="Heading1"/>
-        <w:spacing w:after="180" w:before="240"/>
+        <w:spacing w:after="180" w:before="360"/>
       </w:pPr>
       <w:r>
         <w:rPr>
@@ -1381,7 +1412,7 @@
           <w:sz w:val="36"/>
           <w:szCs w:val="36"/>
         </w:rPr>
-        <w:t xml:space="preserve">10 Example Questions to Try</w:t>
+        <w:t xml:space="preserve">Download Options</w:t>
       </w:r>
     </w:p>
     <w:p>
@@ -1394,7 +1425,836 @@
           <w:sz w:val="22"/>
           <w:szCs w:val="22"/>
         </w:rPr>
+        <w:t xml:space="preserve">Every result includes one or more download buttons. Pick the format that matches where your story is going next.</w:t>
+      </w:r>
+    </w:p>
+    <w:tbl>
+      <w:tblPr>
+        <w:tblW w:type="dxa" w:w="9360"/>
+        <w:tblBorders>
+          <w:top w:val="single" w:color="auto" w:sz="4"/>
+          <w:left w:val="single" w:color="auto" w:sz="4"/>
+          <w:bottom w:val="single" w:color="auto" w:sz="4"/>
+          <w:right w:val="single" w:color="auto" w:sz="4"/>
+          <w:insideH w:val="single" w:color="auto" w:sz="4"/>
+          <w:insideV w:val="single" w:color="auto" w:sz="4"/>
+        </w:tblBorders>
+      </w:tblPr>
+      <w:tblGrid>
+        <w:gridCol w:w="1800"/>
+        <w:gridCol w:w="1800"/>
+        <w:gridCol w:w="5760"/>
+      </w:tblGrid>
+      <w:tr>
+        <w:trPr>
+          <w:tblHeader/>
+        </w:trPr>
+        <w:tc>
+          <w:tcPr>
+            <w:tcW w:type="dxa" w:w="1800"/>
+            <w:tcBorders>
+              <w:top w:val="single" w:color="D0D8E0" w:sz="6"/>
+              <w:left w:val="single" w:color="D0D8E0" w:sz="6"/>
+              <w:bottom w:val="single" w:color="D0D8E0" w:sz="6"/>
+              <w:right w:val="single" w:color="D0D8E0" w:sz="6"/>
+            </w:tcBorders>
+            <w:shd w:fill="00857A" w:color="auto" w:val="clear"/>
+            <w:tcMar>
+              <w:top w:type="dxa" w:w="100"/>
+              <w:left w:type="dxa" w:w="140"/>
+              <w:bottom w:type="dxa" w:w="100"/>
+              <w:right w:type="dxa" w:w="140"/>
+            </w:tcMar>
+          </w:tcPr>
+          <w:p>
+            <w:r>
+              <w:rPr>
+                <w:b/>
+                <w:bCs/>
+                <w:color w:val="FFFFFF"/>
+                <w:sz w:val="22"/>
+                <w:szCs w:val="22"/>
+              </w:rPr>
+              <w:t xml:space="preserve">Output Type</w:t>
+            </w:r>
+          </w:p>
+        </w:tc>
+        <w:tc>
+          <w:tcPr>
+            <w:tcW w:type="dxa" w:w="1800"/>
+            <w:tcBorders>
+              <w:top w:val="single" w:color="D0D8E0" w:sz="6"/>
+              <w:left w:val="single" w:color="D0D8E0" w:sz="6"/>
+              <w:bottom w:val="single" w:color="D0D8E0" w:sz="6"/>
+              <w:right w:val="single" w:color="D0D8E0" w:sz="6"/>
+            </w:tcBorders>
+            <w:shd w:fill="00857A" w:color="auto" w:val="clear"/>
+            <w:tcMar>
+              <w:top w:type="dxa" w:w="100"/>
+              <w:left w:type="dxa" w:w="140"/>
+              <w:bottom w:type="dxa" w:w="100"/>
+              <w:right w:type="dxa" w:w="140"/>
+            </w:tcMar>
+          </w:tcPr>
+          <w:p>
+            <w:r>
+              <w:rPr>
+                <w:b/>
+                <w:bCs/>
+                <w:color w:val="FFFFFF"/>
+                <w:sz w:val="22"/>
+                <w:szCs w:val="22"/>
+              </w:rPr>
+              <w:t xml:space="preserve">Format</w:t>
+            </w:r>
+          </w:p>
+        </w:tc>
+        <w:tc>
+          <w:tcPr>
+            <w:tcW w:type="dxa" w:w="5760"/>
+            <w:tcBorders>
+              <w:top w:val="single" w:color="D0D8E0" w:sz="6"/>
+              <w:left w:val="single" w:color="D0D8E0" w:sz="6"/>
+              <w:bottom w:val="single" w:color="D0D8E0" w:sz="6"/>
+              <w:right w:val="single" w:color="D0D8E0" w:sz="6"/>
+            </w:tcBorders>
+            <w:shd w:fill="00857A" w:color="auto" w:val="clear"/>
+            <w:tcMar>
+              <w:top w:type="dxa" w:w="100"/>
+              <w:left w:type="dxa" w:w="140"/>
+              <w:bottom w:type="dxa" w:w="100"/>
+              <w:right w:type="dxa" w:w="140"/>
+            </w:tcMar>
+          </w:tcPr>
+          <w:p>
+            <w:r>
+              <w:rPr>
+                <w:b/>
+                <w:bCs/>
+                <w:color w:val="FFFFFF"/>
+                <w:sz w:val="22"/>
+                <w:szCs w:val="22"/>
+              </w:rPr>
+              <w:t xml:space="preserve">What You Get</w:t>
+            </w:r>
+          </w:p>
+        </w:tc>
+      </w:tr>
+      <w:tr>
+        <w:tc>
+          <w:tcPr>
+            <w:tcW w:type="dxa" w:w="1800"/>
+            <w:tcBorders>
+              <w:top w:val="single" w:color="D0D8E0" w:sz="6"/>
+              <w:left w:val="single" w:color="D0D8E0" w:sz="6"/>
+              <w:bottom w:val="single" w:color="D0D8E0" w:sz="6"/>
+              <w:right w:val="single" w:color="D0D8E0" w:sz="6"/>
+            </w:tcBorders>
+            <w:shd w:fill="E6F4F3" w:color="auto" w:val="clear"/>
+            <w:tcMar>
+              <w:top w:type="dxa" w:w="100"/>
+              <w:left w:type="dxa" w:w="140"/>
+              <w:bottom w:type="dxa" w:w="100"/>
+              <w:right w:type="dxa" w:w="140"/>
+            </w:tcMar>
+          </w:tcPr>
+          <w:p>
+            <w:r>
+              <w:rPr>
+                <w:b/>
+                <w:bCs/>
+                <w:color w:val="1A2B3C"/>
+                <w:sz w:val="21"/>
+                <w:szCs w:val="21"/>
+              </w:rPr>
+              <w:t xml:space="preserve">Chart</w:t>
+            </w:r>
+          </w:p>
+        </w:tc>
+        <w:tc>
+          <w:tcPr>
+            <w:tcW w:type="dxa" w:w="1800"/>
+            <w:tcBorders>
+              <w:top w:val="single" w:color="D0D8E0" w:sz="6"/>
+              <w:left w:val="single" w:color="D0D8E0" w:sz="6"/>
+              <w:bottom w:val="single" w:color="D0D8E0" w:sz="6"/>
+              <w:right w:val="single" w:color="D0D8E0" w:sz="6"/>
+            </w:tcBorders>
+            <w:shd w:fill="E6F4F3" w:color="auto" w:val="clear"/>
+            <w:tcMar>
+              <w:top w:type="dxa" w:w="100"/>
+              <w:left w:type="dxa" w:w="140"/>
+              <w:bottom w:type="dxa" w:w="100"/>
+              <w:right w:type="dxa" w:w="140"/>
+            </w:tcMar>
+          </w:tcPr>
+          <w:p>
+            <w:r>
+              <w:rPr>
+                <w:b w:val="false"/>
+                <w:bCs w:val="false"/>
+                <w:color w:val="1A2B3C"/>
+                <w:sz w:val="21"/>
+                <w:szCs w:val="21"/>
+              </w:rPr>
+              <w:t xml:space="preserve">PNG</w:t>
+            </w:r>
+          </w:p>
+        </w:tc>
+        <w:tc>
+          <w:tcPr>
+            <w:tcW w:type="dxa" w:w="5760"/>
+            <w:tcBorders>
+              <w:top w:val="single" w:color="D0D8E0" w:sz="6"/>
+              <w:left w:val="single" w:color="D0D8E0" w:sz="6"/>
+              <w:bottom w:val="single" w:color="D0D8E0" w:sz="6"/>
+              <w:right w:val="single" w:color="D0D8E0" w:sz="6"/>
+            </w:tcBorders>
+            <w:shd w:fill="E6F4F3" w:color="auto" w:val="clear"/>
+            <w:tcMar>
+              <w:top w:type="dxa" w:w="100"/>
+              <w:left w:type="dxa" w:w="140"/>
+              <w:bottom w:type="dxa" w:w="100"/>
+              <w:right w:type="dxa" w:w="140"/>
+            </w:tcMar>
+          </w:tcPr>
+          <w:p>
+            <w:r>
+              <w:rPr>
+                <w:b w:val="false"/>
+                <w:bCs w:val="false"/>
+                <w:color w:val="1A2B3C"/>
+                <w:sz w:val="21"/>
+                <w:szCs w:val="21"/>
+              </w:rPr>
+              <w:t xml:space="preserve">Just the chart as a sharp image. Use it in reports or embed it in slides.</w:t>
+            </w:r>
+          </w:p>
+        </w:tc>
+      </w:tr>
+      <w:tr>
+        <w:tc>
+          <w:tcPr>
+            <w:tcW w:type="dxa" w:w="1800"/>
+            <w:tcBorders>
+              <w:top w:val="single" w:color="D0D8E0" w:sz="6"/>
+              <w:left w:val="single" w:color="D0D8E0" w:sz="6"/>
+              <w:bottom w:val="single" w:color="D0D8E0" w:sz="6"/>
+              <w:right w:val="single" w:color="D0D8E0" w:sz="6"/>
+            </w:tcBorders>
+            <w:shd w:fill="FFFFFF" w:color="auto" w:val="clear"/>
+            <w:tcMar>
+              <w:top w:type="dxa" w:w="100"/>
+              <w:left w:type="dxa" w:w="140"/>
+              <w:bottom w:type="dxa" w:w="100"/>
+              <w:right w:type="dxa" w:w="140"/>
+            </w:tcMar>
+          </w:tcPr>
+          <w:p>
+            <w:r>
+              <w:rPr>
+                <w:b/>
+                <w:bCs/>
+                <w:color w:val="1A2B3C"/>
+                <w:sz w:val="21"/>
+                <w:szCs w:val="21"/>
+              </w:rPr>
+              <w:t xml:space="preserve">Chart</w:t>
+            </w:r>
+          </w:p>
+        </w:tc>
+        <w:tc>
+          <w:tcPr>
+            <w:tcW w:type="dxa" w:w="1800"/>
+            <w:tcBorders>
+              <w:top w:val="single" w:color="D0D8E0" w:sz="6"/>
+              <w:left w:val="single" w:color="D0D8E0" w:sz="6"/>
+              <w:bottom w:val="single" w:color="D0D8E0" w:sz="6"/>
+              <w:right w:val="single" w:color="D0D8E0" w:sz="6"/>
+            </w:tcBorders>
+            <w:shd w:fill="FFFFFF" w:color="auto" w:val="clear"/>
+            <w:tcMar>
+              <w:top w:type="dxa" w:w="100"/>
+              <w:left w:type="dxa" w:w="140"/>
+              <w:bottom w:type="dxa" w:w="100"/>
+              <w:right w:type="dxa" w:w="140"/>
+            </w:tcMar>
+          </w:tcPr>
+          <w:p>
+            <w:r>
+              <w:rPr>
+                <w:b w:val="false"/>
+                <w:bCs w:val="false"/>
+                <w:color w:val="1A2B3C"/>
+                <w:sz w:val="21"/>
+                <w:szCs w:val="21"/>
+              </w:rPr>
+              <w:t xml:space="preserve">CSV</w:t>
+            </w:r>
+          </w:p>
+        </w:tc>
+        <w:tc>
+          <w:tcPr>
+            <w:tcW w:type="dxa" w:w="5760"/>
+            <w:tcBorders>
+              <w:top w:val="single" w:color="D0D8E0" w:sz="6"/>
+              <w:left w:val="single" w:color="D0D8E0" w:sz="6"/>
+              <w:bottom w:val="single" w:color="D0D8E0" w:sz="6"/>
+              <w:right w:val="single" w:color="D0D8E0" w:sz="6"/>
+            </w:tcBorders>
+            <w:shd w:fill="FFFFFF" w:color="auto" w:val="clear"/>
+            <w:tcMar>
+              <w:top w:type="dxa" w:w="100"/>
+              <w:left w:type="dxa" w:w="140"/>
+              <w:bottom w:type="dxa" w:w="100"/>
+              <w:right w:type="dxa" w:w="140"/>
+            </w:tcMar>
+          </w:tcPr>
+          <w:p>
+            <w:r>
+              <w:rPr>
+                <w:b w:val="false"/>
+                <w:bCs w:val="false"/>
+                <w:color w:val="1A2B3C"/>
+                <w:sz w:val="21"/>
+                <w:szCs w:val="21"/>
+              </w:rPr>
+              <w:t xml:space="preserve">The underlying labels and values, ready to import into Excel.</w:t>
+            </w:r>
+          </w:p>
+        </w:tc>
+      </w:tr>
+      <w:tr>
+        <w:tc>
+          <w:tcPr>
+            <w:tcW w:type="dxa" w:w="1800"/>
+            <w:tcBorders>
+              <w:top w:val="single" w:color="D0D8E0" w:sz="6"/>
+              <w:left w:val="single" w:color="D0D8E0" w:sz="6"/>
+              <w:bottom w:val="single" w:color="D0D8E0" w:sz="6"/>
+              <w:right w:val="single" w:color="D0D8E0" w:sz="6"/>
+            </w:tcBorders>
+            <w:shd w:fill="E6F4F3" w:color="auto" w:val="clear"/>
+            <w:tcMar>
+              <w:top w:type="dxa" w:w="100"/>
+              <w:left w:type="dxa" w:w="140"/>
+              <w:bottom w:type="dxa" w:w="100"/>
+              <w:right w:type="dxa" w:w="140"/>
+            </w:tcMar>
+          </w:tcPr>
+          <w:p>
+            <w:r>
+              <w:rPr>
+                <w:b/>
+                <w:bCs/>
+                <w:color w:val="1A2B3C"/>
+                <w:sz w:val="21"/>
+                <w:szCs w:val="21"/>
+              </w:rPr>
+              <w:t xml:space="preserve">Chart</w:t>
+            </w:r>
+          </w:p>
+        </w:tc>
+        <w:tc>
+          <w:tcPr>
+            <w:tcW w:type="dxa" w:w="1800"/>
+            <w:tcBorders>
+              <w:top w:val="single" w:color="D0D8E0" w:sz="6"/>
+              <w:left w:val="single" w:color="D0D8E0" w:sz="6"/>
+              <w:bottom w:val="single" w:color="D0D8E0" w:sz="6"/>
+              <w:right w:val="single" w:color="D0D8E0" w:sz="6"/>
+            </w:tcBorders>
+            <w:shd w:fill="E6F4F3" w:color="auto" w:val="clear"/>
+            <w:tcMar>
+              <w:top w:type="dxa" w:w="100"/>
+              <w:left w:type="dxa" w:w="140"/>
+              <w:bottom w:type="dxa" w:w="100"/>
+              <w:right w:type="dxa" w:w="140"/>
+            </w:tcMar>
+          </w:tcPr>
+          <w:p>
+            <w:r>
+              <w:rPr>
+                <w:b w:val="false"/>
+                <w:bCs w:val="false"/>
+                <w:color w:val="1A2B3C"/>
+                <w:sz w:val="21"/>
+                <w:szCs w:val="21"/>
+              </w:rPr>
+              <w:t xml:space="preserve">Slide</w:t>
+            </w:r>
+          </w:p>
+        </w:tc>
+        <w:tc>
+          <w:tcPr>
+            <w:tcW w:type="dxa" w:w="5760"/>
+            <w:tcBorders>
+              <w:top w:val="single" w:color="D0D8E0" w:sz="6"/>
+              <w:left w:val="single" w:color="D0D8E0" w:sz="6"/>
+              <w:bottom w:val="single" w:color="D0D8E0" w:sz="6"/>
+              <w:right w:val="single" w:color="D0D8E0" w:sz="6"/>
+            </w:tcBorders>
+            <w:shd w:fill="E6F4F3" w:color="auto" w:val="clear"/>
+            <w:tcMar>
+              <w:top w:type="dxa" w:w="100"/>
+              <w:left w:type="dxa" w:w="140"/>
+              <w:bottom w:type="dxa" w:w="100"/>
+              <w:right w:type="dxa" w:w="140"/>
+            </w:tcMar>
+          </w:tcPr>
+          <w:p>
+            <w:r>
+              <w:rPr>
+                <w:b w:val="false"/>
+                <w:bCs w:val="false"/>
+                <w:color w:val="1A2B3C"/>
+                <w:sz w:val="21"/>
+                <w:szCs w:val="21"/>
+              </w:rPr>
+              <w:t xml:space="preserve">A 1920×1080 PowerPoint-ready image that bundles the question, written answer, key metric cards, AND chart together — drop it onto one slide for a complete story.</w:t>
+            </w:r>
+          </w:p>
+        </w:tc>
+      </w:tr>
+      <w:tr>
+        <w:tc>
+          <w:tcPr>
+            <w:tcW w:type="dxa" w:w="1800"/>
+            <w:tcBorders>
+              <w:top w:val="single" w:color="D0D8E0" w:sz="6"/>
+              <w:left w:val="single" w:color="D0D8E0" w:sz="6"/>
+              <w:bottom w:val="single" w:color="D0D8E0" w:sz="6"/>
+              <w:right w:val="single" w:color="D0D8E0" w:sz="6"/>
+            </w:tcBorders>
+            <w:shd w:fill="FFFFFF" w:color="auto" w:val="clear"/>
+            <w:tcMar>
+              <w:top w:type="dxa" w:w="100"/>
+              <w:left w:type="dxa" w:w="140"/>
+              <w:bottom w:type="dxa" w:w="100"/>
+              <w:right w:type="dxa" w:w="140"/>
+            </w:tcMar>
+          </w:tcPr>
+          <w:p>
+            <w:r>
+              <w:rPr>
+                <w:b/>
+                <w:bCs/>
+                <w:color w:val="1A2B3C"/>
+                <w:sz w:val="21"/>
+                <w:szCs w:val="21"/>
+              </w:rPr>
+              <w:t xml:space="preserve">Table</w:t>
+            </w:r>
+          </w:p>
+        </w:tc>
+        <w:tc>
+          <w:tcPr>
+            <w:tcW w:type="dxa" w:w="1800"/>
+            <w:tcBorders>
+              <w:top w:val="single" w:color="D0D8E0" w:sz="6"/>
+              <w:left w:val="single" w:color="D0D8E0" w:sz="6"/>
+              <w:bottom w:val="single" w:color="D0D8E0" w:sz="6"/>
+              <w:right w:val="single" w:color="D0D8E0" w:sz="6"/>
+            </w:tcBorders>
+            <w:shd w:fill="FFFFFF" w:color="auto" w:val="clear"/>
+            <w:tcMar>
+              <w:top w:type="dxa" w:w="100"/>
+              <w:left w:type="dxa" w:w="140"/>
+              <w:bottom w:type="dxa" w:w="100"/>
+              <w:right w:type="dxa" w:w="140"/>
+            </w:tcMar>
+          </w:tcPr>
+          <w:p>
+            <w:r>
+              <w:rPr>
+                <w:b w:val="false"/>
+                <w:bCs w:val="false"/>
+                <w:color w:val="1A2B3C"/>
+                <w:sz w:val="21"/>
+                <w:szCs w:val="21"/>
+              </w:rPr>
+              <w:t xml:space="preserve">CSV</w:t>
+            </w:r>
+          </w:p>
+        </w:tc>
+        <w:tc>
+          <w:tcPr>
+            <w:tcW w:type="dxa" w:w="5760"/>
+            <w:tcBorders>
+              <w:top w:val="single" w:color="D0D8E0" w:sz="6"/>
+              <w:left w:val="single" w:color="D0D8E0" w:sz="6"/>
+              <w:bottom w:val="single" w:color="D0D8E0" w:sz="6"/>
+              <w:right w:val="single" w:color="D0D8E0" w:sz="6"/>
+            </w:tcBorders>
+            <w:shd w:fill="FFFFFF" w:color="auto" w:val="clear"/>
+            <w:tcMar>
+              <w:top w:type="dxa" w:w="100"/>
+              <w:left w:type="dxa" w:w="140"/>
+              <w:bottom w:type="dxa" w:w="100"/>
+              <w:right w:type="dxa" w:w="140"/>
+            </w:tcMar>
+          </w:tcPr>
+          <w:p>
+            <w:r>
+              <w:rPr>
+                <w:b w:val="false"/>
+                <w:bCs w:val="false"/>
+                <w:color w:val="1A2B3C"/>
+                <w:sz w:val="21"/>
+                <w:szCs w:val="21"/>
+              </w:rPr>
+              <w:t xml:space="preserve">Raw rows you can open in Excel, Google Sheets, or any analysis tool.</w:t>
+            </w:r>
+          </w:p>
+        </w:tc>
+      </w:tr>
+      <w:tr>
+        <w:tc>
+          <w:tcPr>
+            <w:tcW w:type="dxa" w:w="1800"/>
+            <w:tcBorders>
+              <w:top w:val="single" w:color="D0D8E0" w:sz="6"/>
+              <w:left w:val="single" w:color="D0D8E0" w:sz="6"/>
+              <w:bottom w:val="single" w:color="D0D8E0" w:sz="6"/>
+              <w:right w:val="single" w:color="D0D8E0" w:sz="6"/>
+            </w:tcBorders>
+            <w:shd w:fill="E6F4F3" w:color="auto" w:val="clear"/>
+            <w:tcMar>
+              <w:top w:type="dxa" w:w="100"/>
+              <w:left w:type="dxa" w:w="140"/>
+              <w:bottom w:type="dxa" w:w="100"/>
+              <w:right w:type="dxa" w:w="140"/>
+            </w:tcMar>
+          </w:tcPr>
+          <w:p>
+            <w:r>
+              <w:rPr>
+                <w:b/>
+                <w:bCs/>
+                <w:color w:val="1A2B3C"/>
+                <w:sz w:val="21"/>
+                <w:szCs w:val="21"/>
+              </w:rPr>
+              <w:t xml:space="preserve">Table</w:t>
+            </w:r>
+          </w:p>
+        </w:tc>
+        <w:tc>
+          <w:tcPr>
+            <w:tcW w:type="dxa" w:w="1800"/>
+            <w:tcBorders>
+              <w:top w:val="single" w:color="D0D8E0" w:sz="6"/>
+              <w:left w:val="single" w:color="D0D8E0" w:sz="6"/>
+              <w:bottom w:val="single" w:color="D0D8E0" w:sz="6"/>
+              <w:right w:val="single" w:color="D0D8E0" w:sz="6"/>
+            </w:tcBorders>
+            <w:shd w:fill="E6F4F3" w:color="auto" w:val="clear"/>
+            <w:tcMar>
+              <w:top w:type="dxa" w:w="100"/>
+              <w:left w:type="dxa" w:w="140"/>
+              <w:bottom w:type="dxa" w:w="100"/>
+              <w:right w:type="dxa" w:w="140"/>
+            </w:tcMar>
+          </w:tcPr>
+          <w:p>
+            <w:r>
+              <w:rPr>
+                <w:b w:val="false"/>
+                <w:bCs w:val="false"/>
+                <w:color w:val="1A2B3C"/>
+                <w:sz w:val="21"/>
+                <w:szCs w:val="21"/>
+              </w:rPr>
+              <w:t xml:space="preserve">Excel</w:t>
+            </w:r>
+          </w:p>
+        </w:tc>
+        <w:tc>
+          <w:tcPr>
+            <w:tcW w:type="dxa" w:w="5760"/>
+            <w:tcBorders>
+              <w:top w:val="single" w:color="D0D8E0" w:sz="6"/>
+              <w:left w:val="single" w:color="D0D8E0" w:sz="6"/>
+              <w:bottom w:val="single" w:color="D0D8E0" w:sz="6"/>
+              <w:right w:val="single" w:color="D0D8E0" w:sz="6"/>
+            </w:tcBorders>
+            <w:shd w:fill="E6F4F3" w:color="auto" w:val="clear"/>
+            <w:tcMar>
+              <w:top w:type="dxa" w:w="100"/>
+              <w:left w:type="dxa" w:w="140"/>
+              <w:bottom w:type="dxa" w:w="100"/>
+              <w:right w:type="dxa" w:w="140"/>
+            </w:tcMar>
+          </w:tcPr>
+          <w:p>
+            <w:r>
+              <w:rPr>
+                <w:b w:val="false"/>
+                <w:bCs w:val="false"/>
+                <w:color w:val="1A2B3C"/>
+                <w:sz w:val="21"/>
+                <w:szCs w:val="21"/>
+              </w:rPr>
+              <w:t xml:space="preserve">An .xlsx file with formatted headers, ready for further pivoting.</w:t>
+            </w:r>
+          </w:p>
+        </w:tc>
+      </w:tr>
+      <w:tr>
+        <w:tc>
+          <w:tcPr>
+            <w:tcW w:type="dxa" w:w="1800"/>
+            <w:tcBorders>
+              <w:top w:val="single" w:color="D0D8E0" w:sz="6"/>
+              <w:left w:val="single" w:color="D0D8E0" w:sz="6"/>
+              <w:bottom w:val="single" w:color="D0D8E0" w:sz="6"/>
+              <w:right w:val="single" w:color="D0D8E0" w:sz="6"/>
+            </w:tcBorders>
+            <w:shd w:fill="FFFFFF" w:color="auto" w:val="clear"/>
+            <w:tcMar>
+              <w:top w:type="dxa" w:w="100"/>
+              <w:left w:type="dxa" w:w="140"/>
+              <w:bottom w:type="dxa" w:w="100"/>
+              <w:right w:type="dxa" w:w="140"/>
+            </w:tcMar>
+          </w:tcPr>
+          <w:p>
+            <w:r>
+              <w:rPr>
+                <w:b/>
+                <w:bCs/>
+                <w:color w:val="1A2B3C"/>
+                <w:sz w:val="21"/>
+                <w:szCs w:val="21"/>
+              </w:rPr>
+              <w:t xml:space="preserve">List</w:t>
+            </w:r>
+          </w:p>
+        </w:tc>
+        <w:tc>
+          <w:tcPr>
+            <w:tcW w:type="dxa" w:w="1800"/>
+            <w:tcBorders>
+              <w:top w:val="single" w:color="D0D8E0" w:sz="6"/>
+              <w:left w:val="single" w:color="D0D8E0" w:sz="6"/>
+              <w:bottom w:val="single" w:color="D0D8E0" w:sz="6"/>
+              <w:right w:val="single" w:color="D0D8E0" w:sz="6"/>
+            </w:tcBorders>
+            <w:shd w:fill="FFFFFF" w:color="auto" w:val="clear"/>
+            <w:tcMar>
+              <w:top w:type="dxa" w:w="100"/>
+              <w:left w:type="dxa" w:w="140"/>
+              <w:bottom w:type="dxa" w:w="100"/>
+              <w:right w:type="dxa" w:w="140"/>
+            </w:tcMar>
+          </w:tcPr>
+          <w:p>
+            <w:r>
+              <w:rPr>
+                <w:b w:val="false"/>
+                <w:bCs w:val="false"/>
+                <w:color w:val="1A2B3C"/>
+                <w:sz w:val="21"/>
+                <w:szCs w:val="21"/>
+              </w:rPr>
+              <w:t xml:space="preserve">CSV</w:t>
+            </w:r>
+          </w:p>
+        </w:tc>
+        <w:tc>
+          <w:tcPr>
+            <w:tcW w:type="dxa" w:w="5760"/>
+            <w:tcBorders>
+              <w:top w:val="single" w:color="D0D8E0" w:sz="6"/>
+              <w:left w:val="single" w:color="D0D8E0" w:sz="6"/>
+              <w:bottom w:val="single" w:color="D0D8E0" w:sz="6"/>
+              <w:right w:val="single" w:color="D0D8E0" w:sz="6"/>
+            </w:tcBorders>
+            <w:shd w:fill="FFFFFF" w:color="auto" w:val="clear"/>
+            <w:tcMar>
+              <w:top w:type="dxa" w:w="100"/>
+              <w:left w:type="dxa" w:w="140"/>
+              <w:bottom w:type="dxa" w:w="100"/>
+              <w:right w:type="dxa" w:w="140"/>
+            </w:tcMar>
+          </w:tcPr>
+          <w:p>
+            <w:r>
+              <w:rPr>
+                <w:b w:val="false"/>
+                <w:bCs w:val="false"/>
+                <w:color w:val="1A2B3C"/>
+                <w:sz w:val="21"/>
+                <w:szCs w:val="21"/>
+              </w:rPr>
+              <w:t xml:space="preserve">Each list item as a row, sorted by value.</w:t>
+            </w:r>
+          </w:p>
+        </w:tc>
+      </w:tr>
+      <w:tr>
+        <w:tc>
+          <w:tcPr>
+            <w:tcW w:type="dxa" w:w="1800"/>
+            <w:tcBorders>
+              <w:top w:val="single" w:color="D0D8E0" w:sz="6"/>
+              <w:left w:val="single" w:color="D0D8E0" w:sz="6"/>
+              <w:bottom w:val="single" w:color="D0D8E0" w:sz="6"/>
+              <w:right w:val="single" w:color="D0D8E0" w:sz="6"/>
+            </w:tcBorders>
+            <w:shd w:fill="E6F4F3" w:color="auto" w:val="clear"/>
+            <w:tcMar>
+              <w:top w:type="dxa" w:w="100"/>
+              <w:left w:type="dxa" w:w="140"/>
+              <w:bottom w:type="dxa" w:w="100"/>
+              <w:right w:type="dxa" w:w="140"/>
+            </w:tcMar>
+          </w:tcPr>
+          <w:p>
+            <w:r>
+              <w:rPr>
+                <w:b/>
+                <w:bCs/>
+                <w:color w:val="1A2B3C"/>
+                <w:sz w:val="21"/>
+                <w:szCs w:val="21"/>
+              </w:rPr>
+              <w:t xml:space="preserve">Metrics</w:t>
+            </w:r>
+          </w:p>
+        </w:tc>
+        <w:tc>
+          <w:tcPr>
+            <w:tcW w:type="dxa" w:w="1800"/>
+            <w:tcBorders>
+              <w:top w:val="single" w:color="D0D8E0" w:sz="6"/>
+              <w:left w:val="single" w:color="D0D8E0" w:sz="6"/>
+              <w:bottom w:val="single" w:color="D0D8E0" w:sz="6"/>
+              <w:right w:val="single" w:color="D0D8E0" w:sz="6"/>
+            </w:tcBorders>
+            <w:shd w:fill="E6F4F3" w:color="auto" w:val="clear"/>
+            <w:tcMar>
+              <w:top w:type="dxa" w:w="100"/>
+              <w:left w:type="dxa" w:w="140"/>
+              <w:bottom w:type="dxa" w:w="100"/>
+              <w:right w:type="dxa" w:w="140"/>
+            </w:tcMar>
+          </w:tcPr>
+          <w:p>
+            <w:r>
+              <w:rPr>
+                <w:b w:val="false"/>
+                <w:bCs w:val="false"/>
+                <w:color w:val="1A2B3C"/>
+                <w:sz w:val="21"/>
+                <w:szCs w:val="21"/>
+              </w:rPr>
+              <w:t xml:space="preserve">(included in Slide)</w:t>
+            </w:r>
+          </w:p>
+        </w:tc>
+        <w:tc>
+          <w:tcPr>
+            <w:tcW w:type="dxa" w:w="5760"/>
+            <w:tcBorders>
+              <w:top w:val="single" w:color="D0D8E0" w:sz="6"/>
+              <w:left w:val="single" w:color="D0D8E0" w:sz="6"/>
+              <w:bottom w:val="single" w:color="D0D8E0" w:sz="6"/>
+              <w:right w:val="single" w:color="D0D8E0" w:sz="6"/>
+            </w:tcBorders>
+            <w:shd w:fill="E6F4F3" w:color="auto" w:val="clear"/>
+            <w:tcMar>
+              <w:top w:type="dxa" w:w="100"/>
+              <w:left w:type="dxa" w:w="140"/>
+              <w:bottom w:type="dxa" w:w="100"/>
+              <w:right w:type="dxa" w:w="140"/>
+            </w:tcMar>
+          </w:tcPr>
+          <w:p>
+            <w:r>
+              <w:rPr>
+                <w:b w:val="false"/>
+                <w:bCs w:val="false"/>
+                <w:color w:val="1A2B3C"/>
+                <w:sz w:val="21"/>
+                <w:szCs w:val="21"/>
+              </w:rPr>
+              <w:t xml:space="preserve">Headline numbers travel with the chart on the Slide download.</w:t>
+            </w:r>
+          </w:p>
+        </w:tc>
+      </w:tr>
+    </w:tbl>
+    <w:p>
+      <w:pPr>
+        <w:pBdr>
+          <w:left w:val="single" w:color="00857A" w:sz="24" w:space="12"/>
+        </w:pBdr>
+        <w:spacing w:after="200" w:before="100" w:line="300"/>
+        <w:ind w:left="240"/>
+      </w:pPr>
+      <w:r>
+        <w:rPr>
+          <w:b/>
+          <w:bCs/>
+          <w:color w:val="00857A"/>
+          <w:sz w:val="22"/>
+          <w:szCs w:val="22"/>
+        </w:rPr>
+        <w:t xml:space="preserve">Power user: </w:t>
+      </w:r>
+      <w:r>
+        <w:rPr>
+          <w:color w:val="1A2B3C"/>
+          <w:sz w:val="22"/>
+          <w:szCs w:val="22"/>
+        </w:rPr>
+        <w:t xml:space="preserve">The Slide download is the fastest way to build a deck. Drop one Slide PNG per question into PowerPoint and you have a story ready in minutes — caption, numbers, and chart all on one page.</w:t>
+      </w:r>
+    </w:p>
+    <w:p>
+      <w:pPr>
+        <w:pStyle w:val="Heading1"/>
+        <w:spacing w:after="180" w:before="360"/>
+      </w:pPr>
+      <w:r>
+        <w:rPr>
+          <w:b/>
+          <w:bCs/>
+          <w:color w:val="00857A"/>
+          <w:sz w:val="36"/>
+          <w:szCs w:val="36"/>
+        </w:rPr>
+        <w:t xml:space="preserve">Example Questions to Try</w:t>
+      </w:r>
+    </w:p>
+    <w:p>
+      <w:pPr>
+        <w:spacing w:after="120" w:line="300"/>
+      </w:pPr>
+      <w:r>
+        <w:rPr>
+          <w:color w:val="1A2B3C"/>
+          <w:sz w:val="22"/>
+          <w:szCs w:val="22"/>
+        </w:rPr>
         <w:t xml:space="preserve">Copy any of these into the question box, or use them as templates for your own. The tool understands plain English — you don’t need to write code or formulas.</w:t>
+      </w:r>
+    </w:p>
+    <w:p>
+      <w:pPr>
+        <w:pStyle w:val="Heading2"/>
+        <w:spacing w:after="140" w:before="280"/>
+      </w:pPr>
+      <w:r>
+        <w:rPr>
+          <w:b/>
+          <w:bCs/>
+          <w:color w:val="00857A"/>
+          <w:sz w:val="26"/>
+          <w:szCs w:val="26"/>
+        </w:rPr>
+        <w:t xml:space="preserve">Charts</w:t>
       </w:r>
     </w:p>
     <w:p>
@@ -1404,15 +2264,17 @@
           <w:ilvl w:val="0"/>
           <w:numId w:val="2"/>
         </w:numPr>
-        <w:spacing w:after="80" w:line="280"/>
-      </w:pPr>
-      <w:r>
-        <w:rPr>
+        <w:spacing w:after="100" w:line="280"/>
+      </w:pPr>
+      <w:r>
+        <w:rPr>
+          <w:i/>
+          <w:iCs/>
           <w:color w:val="1A2B3C"/>
           <w:sz w:val="22"/>
           <w:szCs w:val="22"/>
         </w:rPr>
-        <w:t xml:space="preserve">Bar chart of the top 10 active cuts detected in 2024</w:t>
+        <w:t xml:space="preserve">“Bar chart of the top 10 active cuts detected in 2024”</w:t>
       </w:r>
     </w:p>
     <w:p>
@@ -1422,15 +2284,17 @@
           <w:ilvl w:val="0"/>
           <w:numId w:val="2"/>
         </w:numPr>
-        <w:spacing w:after="80" w:line="280"/>
-      </w:pPr>
-      <w:r>
-        <w:rPr>
+        <w:spacing w:after="100" w:line="280"/>
+      </w:pPr>
+      <w:r>
+        <w:rPr>
+          <w:i/>
+          <w:iCs/>
           <w:color w:val="1A2B3C"/>
           <w:sz w:val="22"/>
           <w:szCs w:val="22"/>
         </w:rPr>
-        <w:t xml:space="preserve">Line chart of monthly fentanyl sample count over the past year</w:t>
+        <w:t xml:space="preserve">“Line chart of monthly fentanyl sample count over the past year, with data labels on each point”</w:t>
       </w:r>
     </w:p>
     <w:p>
@@ -1440,15 +2304,17 @@
           <w:ilvl w:val="0"/>
           <w:numId w:val="2"/>
         </w:numPr>
-        <w:spacing w:after="80" w:line="280"/>
-      </w:pPr>
-      <w:r>
-        <w:rPr>
+        <w:spacing w:after="100" w:line="280"/>
+      </w:pPr>
+      <w:r>
+        <w:rPr>
+          <w:i/>
+          <w:iCs/>
           <w:color w:val="1A2B3C"/>
           <w:sz w:val="22"/>
           <w:szCs w:val="22"/>
         </w:rPr>
-        <w:t xml:space="preserve">Pie chart of primary drug classes across all complete samples</w:t>
+        <w:t xml:space="preserve">“Pie chart of primary drug classes across all complete samples”</w:t>
       </w:r>
     </w:p>
     <w:p>
@@ -1458,15 +2324,33 @@
           <w:ilvl w:val="0"/>
           <w:numId w:val="2"/>
         </w:numPr>
-        <w:spacing w:after="80" w:line="280"/>
-      </w:pPr>
-      <w:r>
-        <w:rPr>
+        <w:spacing w:after="100" w:line="280"/>
+      </w:pPr>
+      <w:r>
+        <w:rPr>
+          <w:i/>
+          <w:iCs/>
           <w:color w:val="1A2B3C"/>
           <w:sz w:val="22"/>
           <w:szCs w:val="22"/>
         </w:rPr>
-        <w:t xml:space="preserve">Table of sample counts by state</w:t>
+        <w:t xml:space="preserve">“Stacked bar chart of drug classes by state”</w:t>
+      </w:r>
+    </w:p>
+    <w:p>
+      <w:pPr>
+        <w:pStyle w:val="Heading2"/>
+        <w:spacing w:after="140" w:before="280"/>
+      </w:pPr>
+      <w:r>
+        <w:rPr>
+          <w:b/>
+          <w:bCs/>
+          <w:color w:val="00857A"/>
+          <w:sz w:val="26"/>
+          <w:szCs w:val="26"/>
+        </w:rPr>
+        <w:t xml:space="preserve">Tables and rankings</w:t>
       </w:r>
     </w:p>
     <w:p>
@@ -1476,15 +2360,17 @@
           <w:ilvl w:val="0"/>
           <w:numId w:val="2"/>
         </w:numPr>
-        <w:spacing w:after="80" w:line="280"/>
-      </w:pPr>
-      <w:r>
-        <w:rPr>
+        <w:spacing w:after="100" w:line="280"/>
+      </w:pPr>
+      <w:r>
+        <w:rPr>
+          <w:i/>
+          <w:iCs/>
           <w:color w:val="1A2B3C"/>
           <w:sz w:val="22"/>
           <w:szCs w:val="22"/>
         </w:rPr>
-        <w:t xml:space="preserve">List all unique active cuts ever detected</w:t>
+        <w:t xml:space="preserve">“Table of sample counts by state”</w:t>
       </w:r>
     </w:p>
     <w:p>
@@ -1494,15 +2380,17 @@
           <w:ilvl w:val="0"/>
           <w:numId w:val="2"/>
         </w:numPr>
-        <w:spacing w:after="80" w:line="280"/>
-      </w:pPr>
-      <w:r>
-        <w:rPr>
+        <w:spacing w:after="100" w:line="280"/>
+      </w:pPr>
+      <w:r>
+        <w:rPr>
+          <w:i/>
+          <w:iCs/>
           <w:color w:val="1A2B3C"/>
           <w:sz w:val="22"/>
           <w:szCs w:val="22"/>
         </w:rPr>
-        <w:t xml:space="preserve">What percent of cocaine samples also contained fentanyl?</w:t>
+        <w:t xml:space="preserve">“Table of the top 10 towns by sample count”</w:t>
       </w:r>
     </w:p>
     <w:p>
@@ -1512,15 +2400,17 @@
           <w:ilvl w:val="0"/>
           <w:numId w:val="2"/>
         </w:numPr>
-        <w:spacing w:after="80" w:line="280"/>
-      </w:pPr>
-      <w:r>
-        <w:rPr>
+        <w:spacing w:after="100" w:line="280"/>
+      </w:pPr>
+      <w:r>
+        <w:rPr>
+          <w:i/>
+          <w:iCs/>
           <w:color w:val="1A2B3C"/>
           <w:sz w:val="22"/>
           <w:szCs w:val="22"/>
         </w:rPr>
-        <w:t xml:space="preserve">Table of the top 10 towns by sample count</w:t>
+        <w:t xml:space="preserve">“List all unique active cuts ever detected”</w:t>
       </w:r>
     </w:p>
     <w:p>
@@ -1530,15 +2420,33 @@
           <w:ilvl w:val="0"/>
           <w:numId w:val="2"/>
         </w:numPr>
-        <w:spacing w:after="80" w:line="280"/>
-      </w:pPr>
-      <w:r>
-        <w:rPr>
+        <w:spacing w:after="100" w:line="280"/>
+      </w:pPr>
+      <w:r>
+        <w:rPr>
+          <w:i/>
+          <w:iCs/>
           <w:color w:val="1A2B3C"/>
           <w:sz w:val="22"/>
           <w:szCs w:val="22"/>
         </w:rPr>
-        <w:t xml:space="preserve">Which state had the highest polysubstance rate?</w:t>
+        <w:t xml:space="preserve">“Top 5 most common substance combinations in 2024”</w:t>
+      </w:r>
+    </w:p>
+    <w:p>
+      <w:pPr>
+        <w:pStyle w:val="Heading2"/>
+        <w:spacing w:after="140" w:before="280"/>
+      </w:pPr>
+      <w:r>
+        <w:rPr>
+          <w:b/>
+          <w:bCs/>
+          <w:color w:val="00857A"/>
+          <w:sz w:val="26"/>
+          <w:szCs w:val="26"/>
+        </w:rPr>
+        <w:t xml:space="preserve">Percentages and comparisons</w:t>
       </w:r>
     </w:p>
     <w:p>
@@ -1548,15 +2456,17 @@
           <w:ilvl w:val="0"/>
           <w:numId w:val="2"/>
         </w:numPr>
-        <w:spacing w:after="80" w:line="280"/>
-      </w:pPr>
-      <w:r>
-        <w:rPr>
+        <w:spacing w:after="100" w:line="280"/>
+      </w:pPr>
+      <w:r>
+        <w:rPr>
+          <w:i/>
+          <w:iCs/>
           <w:color w:val="1A2B3C"/>
           <w:sz w:val="22"/>
           <w:szCs w:val="22"/>
         </w:rPr>
-        <w:t xml:space="preserve">Percent of Medetomidine appearances in Fentanyl-primary samples from Massachusetts</w:t>
+        <w:t xml:space="preserve">“What percent of cocaine samples also contained fentanyl?”</w:t>
       </w:r>
     </w:p>
     <w:p>
@@ -1566,21 +2476,63 @@
           <w:ilvl w:val="0"/>
           <w:numId w:val="2"/>
         </w:numPr>
-        <w:spacing w:after="80" w:line="280"/>
-      </w:pPr>
-      <w:r>
-        <w:rPr>
+        <w:spacing w:after="100" w:line="280"/>
+      </w:pPr>
+      <w:r>
+        <w:rPr>
+          <w:i/>
+          <w:iCs/>
           <w:color w:val="1A2B3C"/>
           <w:sz w:val="22"/>
           <w:szCs w:val="22"/>
         </w:rPr>
-        <w:t xml:space="preserve">Compare the top 5 active cuts in 2023 versus 2024</w:t>
+        <w:t xml:space="preserve">“Which state had the highest polysubstance rate?”</w:t>
+      </w:r>
+    </w:p>
+    <w:p>
+      <w:pPr>
+        <w:pStyle w:val="ListParagraph"/>
+        <w:numPr>
+          <w:ilvl w:val="0"/>
+          <w:numId w:val="2"/>
+        </w:numPr>
+        <w:spacing w:after="100" w:line="280"/>
+      </w:pPr>
+      <w:r>
+        <w:rPr>
+          <w:i/>
+          <w:iCs/>
+          <w:color w:val="1A2B3C"/>
+          <w:sz w:val="22"/>
+          <w:szCs w:val="22"/>
+        </w:rPr>
+        <w:t xml:space="preserve">“Percent of Medetomidine appearances in Fentanyl-primary samples from Massachusetts”</w:t>
+      </w:r>
+    </w:p>
+    <w:p>
+      <w:pPr>
+        <w:pStyle w:val="ListParagraph"/>
+        <w:numPr>
+          <w:ilvl w:val="0"/>
+          <w:numId w:val="2"/>
+        </w:numPr>
+        <w:spacing w:after="100" w:line="280"/>
+      </w:pPr>
+      <w:r>
+        <w:rPr>
+          <w:i/>
+          <w:iCs/>
+          <w:color w:val="1A2B3C"/>
+          <w:sz w:val="22"/>
+          <w:szCs w:val="22"/>
+        </w:rPr>
+        <w:t xml:space="preserve">“Compare the top 5 active cuts in 2023 versus 2024”</w:t>
       </w:r>
     </w:p>
     <w:p>
       <w:pPr>
         <w:pStyle w:val="Heading1"/>
-        <w:spacing w:after="180" w:before="240"/>
+        <w:spacing w:after="180" w:before="360"/>
       </w:pPr>
       <w:r>
         <w:rPr>
@@ -1591,6 +2543,35 @@
           <w:szCs w:val="36"/>
         </w:rPr>
         <w:t xml:space="preserve">Tips for Better Questions</w:t>
+      </w:r>
+    </w:p>
+    <w:p>
+      <w:pPr>
+        <w:spacing w:after="120" w:line="300"/>
+      </w:pPr>
+      <w:r>
+        <w:rPr>
+          <w:color w:val="1A2B3C"/>
+          <w:sz w:val="22"/>
+          <w:szCs w:val="22"/>
+        </w:rPr>
+        <w:t xml:space="preserve">Small wording tweaks can make a big difference in the answer. Here are patterns that consistently work well:</w:t>
+      </w:r>
+    </w:p>
+    <w:p>
+      <w:pPr>
+        <w:pStyle w:val="Heading2"/>
+        <w:spacing w:after="140" w:before="280"/>
+      </w:pPr>
+      <w:r>
+        <w:rPr>
+          <w:b/>
+          <w:bCs/>
+          <w:color w:val="00857A"/>
+          <w:sz w:val="26"/>
+          <w:szCs w:val="26"/>
+        </w:rPr>
+        <w:t xml:space="preserve">Be specific</w:t>
       </w:r>
     </w:p>
     <w:p>
@@ -1604,11 +2585,21 @@
       </w:pPr>
       <w:r>
         <w:rPr>
+          <w:b/>
+          <w:bCs/>
+          <w:color w:val="00857A"/>
+          <w:sz w:val="22"/>
+          <w:szCs w:val="22"/>
+        </w:rPr>
+        <w:t xml:space="preserve">Time range: </w:t>
+      </w:r>
+      <w:r>
+        <w:rPr>
           <w:color w:val="1A2B3C"/>
           <w:sz w:val="22"/>
           <w:szCs w:val="22"/>
         </w:rPr>
-        <w:t xml:space="preserve">Be specific about the time range (e.g., “in 2024”, “last 6 months”).</w:t>
+        <w:t xml:space="preserve">say “in 2024”, “last 6 months”, or “between January and June 2025” so the tool knows what window to look at.</w:t>
       </w:r>
     </w:p>
     <w:p>
@@ -1622,11 +2613,21 @@
       </w:pPr>
       <w:r>
         <w:rPr>
+          <w:b/>
+          <w:bCs/>
+          <w:color w:val="00857A"/>
+          <w:sz w:val="22"/>
+          <w:szCs w:val="22"/>
+        </w:rPr>
+        <w:t xml:space="preserve">Geography: </w:t>
+      </w:r>
+      <w:r>
+        <w:rPr>
           <w:color w:val="1A2B3C"/>
           <w:sz w:val="22"/>
           <w:szCs w:val="22"/>
         </w:rPr>
-        <w:t xml:space="preserve">Mention the chart type if you have a preference (“bar chart of...”, “table of...”).</w:t>
+        <w:t xml:space="preserve">filter to a single state or county when you can — “in Massachusetts”, “in Suffolk County”.</w:t>
       </w:r>
     </w:p>
     <w:p>
@@ -1640,11 +2641,21 @@
       </w:pPr>
       <w:r>
         <w:rPr>
+          <w:b/>
+          <w:bCs/>
+          <w:color w:val="00857A"/>
+          <w:sz w:val="22"/>
+          <w:szCs w:val="22"/>
+        </w:rPr>
+        <w:t xml:space="preserve">Substance names: </w:t>
+      </w:r>
+      <w:r>
+        <w:rPr>
           <w:color w:val="1A2B3C"/>
           <w:sz w:val="22"/>
           <w:szCs w:val="22"/>
         </w:rPr>
-        <w:t xml:space="preserve">Use the exact substance names you see in the data when possible.</w:t>
+        <w:t xml:space="preserve">use the exact spelling you see in the data (e.g., “Medetomidine”, not “medi”).</w:t>
       </w:r>
     </w:p>
     <w:p>
@@ -1658,11 +2669,37 @@
       </w:pPr>
       <w:r>
         <w:rPr>
+          <w:b/>
+          <w:bCs/>
+          <w:color w:val="00857A"/>
+          <w:sz w:val="22"/>
+          <w:szCs w:val="22"/>
+        </w:rPr>
+        <w:t xml:space="preserve">Count vs. percent: </w:t>
+      </w:r>
+      <w:r>
+        <w:rPr>
           <w:color w:val="1A2B3C"/>
           <w:sz w:val="22"/>
           <w:szCs w:val="22"/>
         </w:rPr>
-        <w:t xml:space="preserve">For rankings, say how many you want (“top 5”, “top 10”).</w:t>
+        <w:t xml:space="preserve">decide whether you want raw counts (“how many samples”) or a share (“what percent”).</w:t>
+      </w:r>
+    </w:p>
+    <w:p>
+      <w:pPr>
+        <w:pStyle w:val="Heading2"/>
+        <w:spacing w:after="140" w:before="280"/>
+      </w:pPr>
+      <w:r>
+        <w:rPr>
+          <w:b/>
+          <w:bCs/>
+          <w:color w:val="00857A"/>
+          <w:sz w:val="26"/>
+          <w:szCs w:val="26"/>
+        </w:rPr>
+        <w:t xml:space="preserve">Customize the visual</w:t>
       </w:r>
     </w:p>
     <w:p>
@@ -1676,11 +2713,1016 @@
       </w:pPr>
       <w:r>
         <w:rPr>
+          <w:b/>
+          <w:bCs/>
+          <w:color w:val="00857A"/>
+          <w:sz w:val="22"/>
+          <w:szCs w:val="22"/>
+        </w:rPr>
+        <w:t xml:space="preserve">Chart type: </w:t>
+      </w:r>
+      <w:r>
+        <w:rPr>
           <w:color w:val="1A2B3C"/>
           <w:sz w:val="22"/>
           <w:szCs w:val="22"/>
         </w:rPr>
-        <w:t xml:space="preserve">If you get an unexpected answer, try rephrasing or being more specific.</w:t>
+        <w:t xml:space="preserve">lead with “bar chart of…”, “line chart of…”, “pie chart of…”, or “table of…” so the tool picks the right format.</w:t>
+      </w:r>
+    </w:p>
+    <w:p>
+      <w:pPr>
+        <w:pStyle w:val="ListParagraph"/>
+        <w:numPr>
+          <w:ilvl w:val="0"/>
+          <w:numId w:val="3"/>
+        </w:numPr>
+        <w:spacing w:after="80" w:line="280"/>
+      </w:pPr>
+      <w:r>
+        <w:rPr>
+          <w:b/>
+          <w:bCs/>
+          <w:color w:val="00857A"/>
+          <w:sz w:val="22"/>
+          <w:szCs w:val="22"/>
+        </w:rPr>
+        <w:t xml:space="preserve">Insert labels in the line chart: </w:t>
+      </w:r>
+      <w:r>
+        <w:rPr>
+          <w:color w:val="1A2B3C"/>
+          <w:sz w:val="22"/>
+          <w:szCs w:val="22"/>
+        </w:rPr>
+        <w:t xml:space="preserve">add “with data labels on each point” or “annotate each point with its value” so the actual numbers appear on the chart.</w:t>
+      </w:r>
+    </w:p>
+    <w:p>
+      <w:pPr>
+        <w:pStyle w:val="ListParagraph"/>
+        <w:numPr>
+          <w:ilvl w:val="0"/>
+          <w:numId w:val="3"/>
+        </w:numPr>
+        <w:spacing w:after="80" w:line="280"/>
+      </w:pPr>
+      <w:r>
+        <w:rPr>
+          <w:b/>
+          <w:bCs/>
+          <w:color w:val="00857A"/>
+          <w:sz w:val="22"/>
+          <w:szCs w:val="22"/>
+        </w:rPr>
+        <w:t xml:space="preserve">Top-N rankings: </w:t>
+      </w:r>
+      <w:r>
+        <w:rPr>
+          <w:color w:val="1A2B3C"/>
+          <w:sz w:val="22"/>
+          <w:szCs w:val="22"/>
+        </w:rPr>
+        <w:t xml:space="preserve">always say how many — “top 5”, “top 10”, “top 20” — otherwise the chart can get crowded.</w:t>
+      </w:r>
+    </w:p>
+    <w:p>
+      <w:pPr>
+        <w:pStyle w:val="ListParagraph"/>
+        <w:numPr>
+          <w:ilvl w:val="0"/>
+          <w:numId w:val="3"/>
+        </w:numPr>
+        <w:spacing w:after="80" w:line="280"/>
+      </w:pPr>
+      <w:r>
+        <w:rPr>
+          <w:b/>
+          <w:bCs/>
+          <w:color w:val="00857A"/>
+          <w:sz w:val="22"/>
+          <w:szCs w:val="22"/>
+        </w:rPr>
+        <w:t xml:space="preserve">Sort order: </w:t>
+      </w:r>
+      <w:r>
+        <w:rPr>
+          <w:color w:val="1A2B3C"/>
+          <w:sz w:val="22"/>
+          <w:szCs w:val="22"/>
+        </w:rPr>
+        <w:t xml:space="preserve">ask for “sorted descending by count” or “sorted alphabetically” when order matters.</w:t>
+      </w:r>
+    </w:p>
+    <w:p>
+      <w:pPr>
+        <w:pStyle w:val="ListParagraph"/>
+        <w:numPr>
+          <w:ilvl w:val="0"/>
+          <w:numId w:val="3"/>
+        </w:numPr>
+        <w:spacing w:after="80" w:line="280"/>
+      </w:pPr>
+      <w:r>
+        <w:rPr>
+          <w:b/>
+          <w:bCs/>
+          <w:color w:val="00857A"/>
+          <w:sz w:val="22"/>
+          <w:szCs w:val="22"/>
+        </w:rPr>
+        <w:t xml:space="preserve">Distinct colors: </w:t>
+      </w:r>
+      <w:r>
+        <w:rPr>
+          <w:color w:val="1A2B3C"/>
+          <w:sz w:val="22"/>
+          <w:szCs w:val="22"/>
+        </w:rPr>
+        <w:t xml:space="preserve">say “use a different color for each bar” when you want the chart to read as categorical.</w:t>
+      </w:r>
+    </w:p>
+    <w:p>
+      <w:pPr>
+        <w:pStyle w:val="Heading2"/>
+        <w:spacing w:after="140" w:before="280"/>
+      </w:pPr>
+      <w:r>
+        <w:rPr>
+          <w:b/>
+          <w:bCs/>
+          <w:color w:val="00857A"/>
+          <w:sz w:val="26"/>
+          <w:szCs w:val="26"/>
+        </w:rPr>
+        <w:t xml:space="preserve">If something goes wrong</w:t>
+      </w:r>
+    </w:p>
+    <w:p>
+      <w:pPr>
+        <w:pStyle w:val="ListParagraph"/>
+        <w:numPr>
+          <w:ilvl w:val="0"/>
+          <w:numId w:val="3"/>
+        </w:numPr>
+        <w:spacing w:after="80" w:line="280"/>
+      </w:pPr>
+      <w:r>
+        <w:rPr>
+          <w:color w:val="1A2B3C"/>
+          <w:sz w:val="22"/>
+          <w:szCs w:val="22"/>
+        </w:rPr>
+        <w:t xml:space="preserve">If the answer looks empty, try rephrasing or being more specific about the time range or filter.</w:t>
+      </w:r>
+    </w:p>
+    <w:p>
+      <w:pPr>
+        <w:pStyle w:val="ListParagraph"/>
+        <w:numPr>
+          <w:ilvl w:val="0"/>
+          <w:numId w:val="3"/>
+        </w:numPr>
+        <w:spacing w:after="80" w:line="280"/>
+      </w:pPr>
+      <w:r>
+        <w:rPr>
+          <w:color w:val="1A2B3C"/>
+          <w:sz w:val="22"/>
+          <w:szCs w:val="22"/>
+        </w:rPr>
+        <w:t xml:space="preserve">If the chart shows fewer items than you expected, say “include all categories” or raise your top-N number.</w:t>
+      </w:r>
+    </w:p>
+    <w:p>
+      <w:pPr>
+        <w:pStyle w:val="ListParagraph"/>
+        <w:numPr>
+          <w:ilvl w:val="0"/>
+          <w:numId w:val="3"/>
+        </w:numPr>
+        <w:spacing w:after="80" w:line="280"/>
+      </w:pPr>
+      <w:r>
+        <w:rPr>
+          <w:color w:val="1A2B3C"/>
+          <w:sz w:val="22"/>
+          <w:szCs w:val="22"/>
+        </w:rPr>
+        <w:t xml:space="preserve">If a number seems off, ask the tool to show the table behind it: “show the underlying counts as a table”.</w:t>
+      </w:r>
+    </w:p>
+    <w:p>
+      <w:pPr>
+        <w:pStyle w:val="Heading1"/>
+        <w:spacing w:after="180" w:before="360"/>
+      </w:pPr>
+      <w:r>
+        <w:rPr>
+          <w:b/>
+          <w:bCs/>
+          <w:color w:val="00857A"/>
+          <w:sz w:val="36"/>
+          <w:szCs w:val="36"/>
+        </w:rPr>
+        <w:t xml:space="preserve">Statistical Tests You Can Run</w:t>
+      </w:r>
+    </w:p>
+    <w:p>
+      <w:pPr>
+        <w:spacing w:after="120" w:line="300"/>
+      </w:pPr>
+      <w:r>
+        <w:rPr>
+          <w:color w:val="1A2B3C"/>
+          <w:sz w:val="22"/>
+          <w:szCs w:val="22"/>
+        </w:rPr>
+        <w:t xml:space="preserve">Beyond simple counts and rankings, the tool can run standard statistical tests directly on your data — useful for telling whether a pattern is real or could be due to chance. Just type the request the way you would ask a colleague.</w:t>
+      </w:r>
+    </w:p>
+    <w:tbl>
+      <w:tblPr>
+        <w:tblW w:type="dxa" w:w="9360"/>
+        <w:tblBorders>
+          <w:top w:val="single" w:color="auto" w:sz="4"/>
+          <w:left w:val="single" w:color="auto" w:sz="4"/>
+          <w:bottom w:val="single" w:color="auto" w:sz="4"/>
+          <w:right w:val="single" w:color="auto" w:sz="4"/>
+          <w:insideH w:val="single" w:color="auto" w:sz="4"/>
+          <w:insideV w:val="single" w:color="auto" w:sz="4"/>
+        </w:tblBorders>
+      </w:tblPr>
+      <w:tblGrid>
+        <w:gridCol w:w="2400"/>
+        <w:gridCol w:w="3800"/>
+        <w:gridCol w:w="3160"/>
+      </w:tblGrid>
+      <w:tr>
+        <w:trPr>
+          <w:tblHeader/>
+        </w:trPr>
+        <w:tc>
+          <w:tcPr>
+            <w:tcW w:type="dxa" w:w="2400"/>
+            <w:tcBorders>
+              <w:top w:val="single" w:color="D0D8E0" w:sz="6"/>
+              <w:left w:val="single" w:color="D0D8E0" w:sz="6"/>
+              <w:bottom w:val="single" w:color="D0D8E0" w:sz="6"/>
+              <w:right w:val="single" w:color="D0D8E0" w:sz="6"/>
+            </w:tcBorders>
+            <w:shd w:fill="00857A" w:color="auto" w:val="clear"/>
+            <w:tcMar>
+              <w:top w:type="dxa" w:w="100"/>
+              <w:left w:type="dxa" w:w="140"/>
+              <w:bottom w:type="dxa" w:w="100"/>
+              <w:right w:type="dxa" w:w="140"/>
+            </w:tcMar>
+          </w:tcPr>
+          <w:p>
+            <w:r>
+              <w:rPr>
+                <w:b/>
+                <w:bCs/>
+                <w:color w:val="FFFFFF"/>
+                <w:sz w:val="22"/>
+                <w:szCs w:val="22"/>
+              </w:rPr>
+              <w:t xml:space="preserve">Use Case</w:t>
+            </w:r>
+          </w:p>
+        </w:tc>
+        <w:tc>
+          <w:tcPr>
+            <w:tcW w:type="dxa" w:w="3800"/>
+            <w:tcBorders>
+              <w:top w:val="single" w:color="D0D8E0" w:sz="6"/>
+              <w:left w:val="single" w:color="D0D8E0" w:sz="6"/>
+              <w:bottom w:val="single" w:color="D0D8E0" w:sz="6"/>
+              <w:right w:val="single" w:color="D0D8E0" w:sz="6"/>
+            </w:tcBorders>
+            <w:shd w:fill="00857A" w:color="auto" w:val="clear"/>
+            <w:tcMar>
+              <w:top w:type="dxa" w:w="100"/>
+              <w:left w:type="dxa" w:w="140"/>
+              <w:bottom w:type="dxa" w:w="100"/>
+              <w:right w:type="dxa" w:w="140"/>
+            </w:tcMar>
+          </w:tcPr>
+          <w:p>
+            <w:r>
+              <w:rPr>
+                <w:b/>
+                <w:bCs/>
+                <w:color w:val="FFFFFF"/>
+                <w:sz w:val="22"/>
+                <w:szCs w:val="22"/>
+              </w:rPr>
+              <w:t xml:space="preserve">What the Test Tells You</w:t>
+            </w:r>
+          </w:p>
+        </w:tc>
+        <w:tc>
+          <w:tcPr>
+            <w:tcW w:type="dxa" w:w="3160"/>
+            <w:tcBorders>
+              <w:top w:val="single" w:color="D0D8E0" w:sz="6"/>
+              <w:left w:val="single" w:color="D0D8E0" w:sz="6"/>
+              <w:bottom w:val="single" w:color="D0D8E0" w:sz="6"/>
+              <w:right w:val="single" w:color="D0D8E0" w:sz="6"/>
+            </w:tcBorders>
+            <w:shd w:fill="00857A" w:color="auto" w:val="clear"/>
+            <w:tcMar>
+              <w:top w:type="dxa" w:w="100"/>
+              <w:left w:type="dxa" w:w="140"/>
+              <w:bottom w:type="dxa" w:w="100"/>
+              <w:right w:type="dxa" w:w="140"/>
+            </w:tcMar>
+          </w:tcPr>
+          <w:p>
+            <w:r>
+              <w:rPr>
+                <w:b/>
+                <w:bCs/>
+                <w:color w:val="FFFFFF"/>
+                <w:sz w:val="22"/>
+                <w:szCs w:val="22"/>
+              </w:rPr>
+              <w:t xml:space="preserve">Example Question to Type</w:t>
+            </w:r>
+          </w:p>
+        </w:tc>
+      </w:tr>
+      <w:tr>
+        <w:tc>
+          <w:tcPr>
+            <w:tcW w:type="dxa" w:w="2400"/>
+            <w:tcBorders>
+              <w:top w:val="single" w:color="D0D8E0" w:sz="6"/>
+              <w:left w:val="single" w:color="D0D8E0" w:sz="6"/>
+              <w:bottom w:val="single" w:color="D0D8E0" w:sz="6"/>
+              <w:right w:val="single" w:color="D0D8E0" w:sz="6"/>
+            </w:tcBorders>
+            <w:shd w:fill="E6F4F3" w:color="auto" w:val="clear"/>
+            <w:tcMar>
+              <w:top w:type="dxa" w:w="100"/>
+              <w:left w:type="dxa" w:w="140"/>
+              <w:bottom w:type="dxa" w:w="100"/>
+              <w:right w:type="dxa" w:w="140"/>
+            </w:tcMar>
+          </w:tcPr>
+          <w:p>
+            <w:r>
+              <w:rPr>
+                <w:b/>
+                <w:bCs/>
+                <w:color w:val="1A2B3C"/>
+                <w:sz w:val="21"/>
+                <w:szCs w:val="21"/>
+              </w:rPr>
+              <w:t xml:space="preserve">Trend over time</w:t>
+            </w:r>
+          </w:p>
+        </w:tc>
+        <w:tc>
+          <w:tcPr>
+            <w:tcW w:type="dxa" w:w="3800"/>
+            <w:tcBorders>
+              <w:top w:val="single" w:color="D0D8E0" w:sz="6"/>
+              <w:left w:val="single" w:color="D0D8E0" w:sz="6"/>
+              <w:bottom w:val="single" w:color="D0D8E0" w:sz="6"/>
+              <w:right w:val="single" w:color="D0D8E0" w:sz="6"/>
+            </w:tcBorders>
+            <w:shd w:fill="E6F4F3" w:color="auto" w:val="clear"/>
+            <w:tcMar>
+              <w:top w:type="dxa" w:w="100"/>
+              <w:left w:type="dxa" w:w="140"/>
+              <w:bottom w:type="dxa" w:w="100"/>
+              <w:right w:type="dxa" w:w="140"/>
+            </w:tcMar>
+          </w:tcPr>
+          <w:p>
+            <w:r>
+              <w:rPr>
+                <w:b w:val="false"/>
+                <w:bCs w:val="false"/>
+                <w:color w:val="1A2B3C"/>
+                <w:sz w:val="21"/>
+                <w:szCs w:val="21"/>
+              </w:rPr>
+              <w:t xml:space="preserve">Run a Mann-Kendall trend test on monthly fentanyl detections to see if the rise (or fall) is statistically significant rather than random noise.</w:t>
+            </w:r>
+          </w:p>
+        </w:tc>
+        <w:tc>
+          <w:tcPr>
+            <w:tcW w:type="dxa" w:w="3160"/>
+            <w:tcBorders>
+              <w:top w:val="single" w:color="D0D8E0" w:sz="6"/>
+              <w:left w:val="single" w:color="D0D8E0" w:sz="6"/>
+              <w:bottom w:val="single" w:color="D0D8E0" w:sz="6"/>
+              <w:right w:val="single" w:color="D0D8E0" w:sz="6"/>
+            </w:tcBorders>
+            <w:shd w:fill="E6F4F3" w:color="auto" w:val="clear"/>
+            <w:tcMar>
+              <w:top w:type="dxa" w:w="100"/>
+              <w:left w:type="dxa" w:w="140"/>
+              <w:bottom w:type="dxa" w:w="100"/>
+              <w:right w:type="dxa" w:w="140"/>
+            </w:tcMar>
+          </w:tcPr>
+          <w:p>
+            <w:r>
+              <w:rPr>
+                <w:b w:val="false"/>
+                <w:bCs w:val="false"/>
+                <w:color w:val="1A2B3C"/>
+                <w:sz w:val="21"/>
+                <w:szCs w:val="21"/>
+              </w:rPr>
+              <w:t xml:space="preserve">“Run a Mann-Kendall trend test on monthly fentanyl detections in 2024”</w:t>
+            </w:r>
+          </w:p>
+        </w:tc>
+      </w:tr>
+      <w:tr>
+        <w:tc>
+          <w:tcPr>
+            <w:tcW w:type="dxa" w:w="2400"/>
+            <w:tcBorders>
+              <w:top w:val="single" w:color="D0D8E0" w:sz="6"/>
+              <w:left w:val="single" w:color="D0D8E0" w:sz="6"/>
+              <w:bottom w:val="single" w:color="D0D8E0" w:sz="6"/>
+              <w:right w:val="single" w:color="D0D8E0" w:sz="6"/>
+            </w:tcBorders>
+            <w:shd w:fill="FFFFFF" w:color="auto" w:val="clear"/>
+            <w:tcMar>
+              <w:top w:type="dxa" w:w="100"/>
+              <w:left w:type="dxa" w:w="140"/>
+              <w:bottom w:type="dxa" w:w="100"/>
+              <w:right w:type="dxa" w:w="140"/>
+            </w:tcMar>
+          </w:tcPr>
+          <w:p>
+            <w:r>
+              <w:rPr>
+                <w:b/>
+                <w:bCs/>
+                <w:color w:val="1A2B3C"/>
+                <w:sz w:val="21"/>
+                <w:szCs w:val="21"/>
+              </w:rPr>
+              <w:t xml:space="preserve">Comparing two groups</w:t>
+            </w:r>
+          </w:p>
+        </w:tc>
+        <w:tc>
+          <w:tcPr>
+            <w:tcW w:type="dxa" w:w="3800"/>
+            <w:tcBorders>
+              <w:top w:val="single" w:color="D0D8E0" w:sz="6"/>
+              <w:left w:val="single" w:color="D0D8E0" w:sz="6"/>
+              <w:bottom w:val="single" w:color="D0D8E0" w:sz="6"/>
+              <w:right w:val="single" w:color="D0D8E0" w:sz="6"/>
+            </w:tcBorders>
+            <w:shd w:fill="FFFFFF" w:color="auto" w:val="clear"/>
+            <w:tcMar>
+              <w:top w:type="dxa" w:w="100"/>
+              <w:left w:type="dxa" w:w="140"/>
+              <w:bottom w:type="dxa" w:w="100"/>
+              <w:right w:type="dxa" w:w="140"/>
+            </w:tcMar>
+          </w:tcPr>
+          <w:p>
+            <w:r>
+              <w:rPr>
+                <w:b w:val="false"/>
+                <w:bCs w:val="false"/>
+                <w:color w:val="1A2B3C"/>
+                <w:sz w:val="21"/>
+                <w:szCs w:val="21"/>
+              </w:rPr>
+              <w:t xml:space="preserve">Use a two-proportion z-test to compare the share of xylazine-positive samples between two states.</w:t>
+            </w:r>
+          </w:p>
+        </w:tc>
+        <w:tc>
+          <w:tcPr>
+            <w:tcW w:type="dxa" w:w="3160"/>
+            <w:tcBorders>
+              <w:top w:val="single" w:color="D0D8E0" w:sz="6"/>
+              <w:left w:val="single" w:color="D0D8E0" w:sz="6"/>
+              <w:bottom w:val="single" w:color="D0D8E0" w:sz="6"/>
+              <w:right w:val="single" w:color="D0D8E0" w:sz="6"/>
+            </w:tcBorders>
+            <w:shd w:fill="FFFFFF" w:color="auto" w:val="clear"/>
+            <w:tcMar>
+              <w:top w:type="dxa" w:w="100"/>
+              <w:left w:type="dxa" w:w="140"/>
+              <w:bottom w:type="dxa" w:w="100"/>
+              <w:right w:type="dxa" w:w="140"/>
+            </w:tcMar>
+          </w:tcPr>
+          <w:p>
+            <w:r>
+              <w:rPr>
+                <w:b w:val="false"/>
+                <w:bCs w:val="false"/>
+                <w:color w:val="1A2B3C"/>
+                <w:sz w:val="21"/>
+                <w:szCs w:val="21"/>
+              </w:rPr>
+              <w:t xml:space="preserve">“Is the proportion of xylazine in fentanyl samples significantly different between Massachusetts and Rhode Island? Run a two-proportion z-test”</w:t>
+            </w:r>
+          </w:p>
+        </w:tc>
+      </w:tr>
+      <w:tr>
+        <w:tc>
+          <w:tcPr>
+            <w:tcW w:type="dxa" w:w="2400"/>
+            <w:tcBorders>
+              <w:top w:val="single" w:color="D0D8E0" w:sz="6"/>
+              <w:left w:val="single" w:color="D0D8E0" w:sz="6"/>
+              <w:bottom w:val="single" w:color="D0D8E0" w:sz="6"/>
+              <w:right w:val="single" w:color="D0D8E0" w:sz="6"/>
+            </w:tcBorders>
+            <w:shd w:fill="E6F4F3" w:color="auto" w:val="clear"/>
+            <w:tcMar>
+              <w:top w:type="dxa" w:w="100"/>
+              <w:left w:type="dxa" w:w="140"/>
+              <w:bottom w:type="dxa" w:w="100"/>
+              <w:right w:type="dxa" w:w="140"/>
+            </w:tcMar>
+          </w:tcPr>
+          <w:p>
+            <w:r>
+              <w:rPr>
+                <w:b/>
+                <w:bCs/>
+                <w:color w:val="1A2B3C"/>
+                <w:sz w:val="21"/>
+                <w:szCs w:val="21"/>
+              </w:rPr>
+              <w:t xml:space="preserve">Comparing many groups</w:t>
+            </w:r>
+          </w:p>
+        </w:tc>
+        <w:tc>
+          <w:tcPr>
+            <w:tcW w:type="dxa" w:w="3800"/>
+            <w:tcBorders>
+              <w:top w:val="single" w:color="D0D8E0" w:sz="6"/>
+              <w:left w:val="single" w:color="D0D8E0" w:sz="6"/>
+              <w:bottom w:val="single" w:color="D0D8E0" w:sz="6"/>
+              <w:right w:val="single" w:color="D0D8E0" w:sz="6"/>
+            </w:tcBorders>
+            <w:shd w:fill="E6F4F3" w:color="auto" w:val="clear"/>
+            <w:tcMar>
+              <w:top w:type="dxa" w:w="100"/>
+              <w:left w:type="dxa" w:w="140"/>
+              <w:bottom w:type="dxa" w:w="100"/>
+              <w:right w:type="dxa" w:w="140"/>
+            </w:tcMar>
+          </w:tcPr>
+          <w:p>
+            <w:r>
+              <w:rPr>
+                <w:b w:val="false"/>
+                <w:bCs w:val="false"/>
+                <w:color w:val="1A2B3C"/>
+                <w:sz w:val="21"/>
+                <w:szCs w:val="21"/>
+              </w:rPr>
+              <w:t xml:space="preserve">Use a chi-square test of independence to check whether drug class composition depends on state.</w:t>
+            </w:r>
+          </w:p>
+        </w:tc>
+        <w:tc>
+          <w:tcPr>
+            <w:tcW w:type="dxa" w:w="3160"/>
+            <w:tcBorders>
+              <w:top w:val="single" w:color="D0D8E0" w:sz="6"/>
+              <w:left w:val="single" w:color="D0D8E0" w:sz="6"/>
+              <w:bottom w:val="single" w:color="D0D8E0" w:sz="6"/>
+              <w:right w:val="single" w:color="D0D8E0" w:sz="6"/>
+            </w:tcBorders>
+            <w:shd w:fill="E6F4F3" w:color="auto" w:val="clear"/>
+            <w:tcMar>
+              <w:top w:type="dxa" w:w="100"/>
+              <w:left w:type="dxa" w:w="140"/>
+              <w:bottom w:type="dxa" w:w="100"/>
+              <w:right w:type="dxa" w:w="140"/>
+            </w:tcMar>
+          </w:tcPr>
+          <w:p>
+            <w:r>
+              <w:rPr>
+                <w:b w:val="false"/>
+                <w:bCs w:val="false"/>
+                <w:color w:val="1A2B3C"/>
+                <w:sz w:val="21"/>
+                <w:szCs w:val="21"/>
+              </w:rPr>
+              <w:t xml:space="preserve">“Run a chi-square test of independence between PrimaryDrugClass and StateofOriginCleaned”</w:t>
+            </w:r>
+          </w:p>
+        </w:tc>
+      </w:tr>
+      <w:tr>
+        <w:tc>
+          <w:tcPr>
+            <w:tcW w:type="dxa" w:w="2400"/>
+            <w:tcBorders>
+              <w:top w:val="single" w:color="D0D8E0" w:sz="6"/>
+              <w:left w:val="single" w:color="D0D8E0" w:sz="6"/>
+              <w:bottom w:val="single" w:color="D0D8E0" w:sz="6"/>
+              <w:right w:val="single" w:color="D0D8E0" w:sz="6"/>
+            </w:tcBorders>
+            <w:shd w:fill="FFFFFF" w:color="auto" w:val="clear"/>
+            <w:tcMar>
+              <w:top w:type="dxa" w:w="100"/>
+              <w:left w:type="dxa" w:w="140"/>
+              <w:bottom w:type="dxa" w:w="100"/>
+              <w:right w:type="dxa" w:w="140"/>
+            </w:tcMar>
+          </w:tcPr>
+          <w:p>
+            <w:r>
+              <w:rPr>
+                <w:b/>
+                <w:bCs/>
+                <w:color w:val="1A2B3C"/>
+                <w:sz w:val="21"/>
+                <w:szCs w:val="21"/>
+              </w:rPr>
+              <w:t xml:space="preserve">Year-over-year change</w:t>
+            </w:r>
+          </w:p>
+        </w:tc>
+        <w:tc>
+          <w:tcPr>
+            <w:tcW w:type="dxa" w:w="3800"/>
+            <w:tcBorders>
+              <w:top w:val="single" w:color="D0D8E0" w:sz="6"/>
+              <w:left w:val="single" w:color="D0D8E0" w:sz="6"/>
+              <w:bottom w:val="single" w:color="D0D8E0" w:sz="6"/>
+              <w:right w:val="single" w:color="D0D8E0" w:sz="6"/>
+            </w:tcBorders>
+            <w:shd w:fill="FFFFFF" w:color="auto" w:val="clear"/>
+            <w:tcMar>
+              <w:top w:type="dxa" w:w="100"/>
+              <w:left w:type="dxa" w:w="140"/>
+              <w:bottom w:type="dxa" w:w="100"/>
+              <w:right w:type="dxa" w:w="140"/>
+            </w:tcMar>
+          </w:tcPr>
+          <w:p>
+            <w:r>
+              <w:rPr>
+                <w:b w:val="false"/>
+                <w:bCs w:val="false"/>
+                <w:color w:val="1A2B3C"/>
+                <w:sz w:val="21"/>
+                <w:szCs w:val="21"/>
+              </w:rPr>
+              <w:t xml:space="preserve">Use a t-test (or Mann-Whitney U for skewed counts) to test whether monthly sample volume changed between 2023 and 2024.</w:t>
+            </w:r>
+          </w:p>
+        </w:tc>
+        <w:tc>
+          <w:tcPr>
+            <w:tcW w:type="dxa" w:w="3160"/>
+            <w:tcBorders>
+              <w:top w:val="single" w:color="D0D8E0" w:sz="6"/>
+              <w:left w:val="single" w:color="D0D8E0" w:sz="6"/>
+              <w:bottom w:val="single" w:color="D0D8E0" w:sz="6"/>
+              <w:right w:val="single" w:color="D0D8E0" w:sz="6"/>
+            </w:tcBorders>
+            <w:shd w:fill="FFFFFF" w:color="auto" w:val="clear"/>
+            <w:tcMar>
+              <w:top w:type="dxa" w:w="100"/>
+              <w:left w:type="dxa" w:w="140"/>
+              <w:bottom w:type="dxa" w:w="100"/>
+              <w:right w:type="dxa" w:w="140"/>
+            </w:tcMar>
+          </w:tcPr>
+          <w:p>
+            <w:r>
+              <w:rPr>
+                <w:b w:val="false"/>
+                <w:bCs w:val="false"/>
+                <w:color w:val="1A2B3C"/>
+                <w:sz w:val="21"/>
+                <w:szCs w:val="21"/>
+              </w:rPr>
+              <w:t xml:space="preserve">“Compare monthly sample counts in 2023 vs 2024 with a t-test”</w:t>
+            </w:r>
+          </w:p>
+        </w:tc>
+      </w:tr>
+      <w:tr>
+        <w:tc>
+          <w:tcPr>
+            <w:tcW w:type="dxa" w:w="2400"/>
+            <w:tcBorders>
+              <w:top w:val="single" w:color="D0D8E0" w:sz="6"/>
+              <w:left w:val="single" w:color="D0D8E0" w:sz="6"/>
+              <w:bottom w:val="single" w:color="D0D8E0" w:sz="6"/>
+              <w:right w:val="single" w:color="D0D8E0" w:sz="6"/>
+            </w:tcBorders>
+            <w:shd w:fill="E6F4F3" w:color="auto" w:val="clear"/>
+            <w:tcMar>
+              <w:top w:type="dxa" w:w="100"/>
+              <w:left w:type="dxa" w:w="140"/>
+              <w:bottom w:type="dxa" w:w="100"/>
+              <w:right w:type="dxa" w:w="140"/>
+            </w:tcMar>
+          </w:tcPr>
+          <w:p>
+            <w:r>
+              <w:rPr>
+                <w:b/>
+                <w:bCs/>
+                <w:color w:val="1A2B3C"/>
+                <w:sz w:val="21"/>
+                <w:szCs w:val="21"/>
+              </w:rPr>
+              <w:t xml:space="preserve">Co-occurrence association</w:t>
+            </w:r>
+          </w:p>
+        </w:tc>
+        <w:tc>
+          <w:tcPr>
+            <w:tcW w:type="dxa" w:w="3800"/>
+            <w:tcBorders>
+              <w:top w:val="single" w:color="D0D8E0" w:sz="6"/>
+              <w:left w:val="single" w:color="D0D8E0" w:sz="6"/>
+              <w:bottom w:val="single" w:color="D0D8E0" w:sz="6"/>
+              <w:right w:val="single" w:color="D0D8E0" w:sz="6"/>
+            </w:tcBorders>
+            <w:shd w:fill="E6F4F3" w:color="auto" w:val="clear"/>
+            <w:tcMar>
+              <w:top w:type="dxa" w:w="100"/>
+              <w:left w:type="dxa" w:w="140"/>
+              <w:bottom w:type="dxa" w:w="100"/>
+              <w:right w:type="dxa" w:w="140"/>
+            </w:tcMar>
+          </w:tcPr>
+          <w:p>
+            <w:r>
+              <w:rPr>
+                <w:b w:val="false"/>
+                <w:bCs w:val="false"/>
+                <w:color w:val="1A2B3C"/>
+                <w:sz w:val="21"/>
+                <w:szCs w:val="21"/>
+              </w:rPr>
+              <w:t xml:space="preserve">Use Fisher’s exact test or chi-square to check whether two substances appear together more often than chance.</w:t>
+            </w:r>
+          </w:p>
+        </w:tc>
+        <w:tc>
+          <w:tcPr>
+            <w:tcW w:type="dxa" w:w="3160"/>
+            <w:tcBorders>
+              <w:top w:val="single" w:color="D0D8E0" w:sz="6"/>
+              <w:left w:val="single" w:color="D0D8E0" w:sz="6"/>
+              <w:bottom w:val="single" w:color="D0D8E0" w:sz="6"/>
+              <w:right w:val="single" w:color="D0D8E0" w:sz="6"/>
+            </w:tcBorders>
+            <w:shd w:fill="E6F4F3" w:color="auto" w:val="clear"/>
+            <w:tcMar>
+              <w:top w:type="dxa" w:w="100"/>
+              <w:left w:type="dxa" w:w="140"/>
+              <w:bottom w:type="dxa" w:w="100"/>
+              <w:right w:type="dxa" w:w="140"/>
+            </w:tcMar>
+          </w:tcPr>
+          <w:p>
+            <w:r>
+              <w:rPr>
+                <w:b w:val="false"/>
+                <w:bCs w:val="false"/>
+                <w:color w:val="1A2B3C"/>
+                <w:sz w:val="21"/>
+                <w:szCs w:val="21"/>
+              </w:rPr>
+              <w:t xml:space="preserve">“Is Medetomidine independent of Xylazine in fentanyl-positive samples? Run a chi-square test”</w:t>
+            </w:r>
+          </w:p>
+        </w:tc>
+      </w:tr>
+      <w:tr>
+        <w:tc>
+          <w:tcPr>
+            <w:tcW w:type="dxa" w:w="2400"/>
+            <w:tcBorders>
+              <w:top w:val="single" w:color="D0D8E0" w:sz="6"/>
+              <w:left w:val="single" w:color="D0D8E0" w:sz="6"/>
+              <w:bottom w:val="single" w:color="D0D8E0" w:sz="6"/>
+              <w:right w:val="single" w:color="D0D8E0" w:sz="6"/>
+            </w:tcBorders>
+            <w:shd w:fill="FFFFFF" w:color="auto" w:val="clear"/>
+            <w:tcMar>
+              <w:top w:type="dxa" w:w="100"/>
+              <w:left w:type="dxa" w:w="140"/>
+              <w:bottom w:type="dxa" w:w="100"/>
+              <w:right w:type="dxa" w:w="140"/>
+            </w:tcMar>
+          </w:tcPr>
+          <w:p>
+            <w:r>
+              <w:rPr>
+                <w:b/>
+                <w:bCs/>
+                <w:color w:val="1A2B3C"/>
+                <w:sz w:val="21"/>
+                <w:szCs w:val="21"/>
+              </w:rPr>
+              <w:t xml:space="preserve">Lab vs. field agreement</w:t>
+            </w:r>
+          </w:p>
+        </w:tc>
+        <w:tc>
+          <w:tcPr>
+            <w:tcW w:type="dxa" w:w="3800"/>
+            <w:tcBorders>
+              <w:top w:val="single" w:color="D0D8E0" w:sz="6"/>
+              <w:left w:val="single" w:color="D0D8E0" w:sz="6"/>
+              <w:bottom w:val="single" w:color="D0D8E0" w:sz="6"/>
+              <w:right w:val="single" w:color="D0D8E0" w:sz="6"/>
+            </w:tcBorders>
+            <w:shd w:fill="FFFFFF" w:color="auto" w:val="clear"/>
+            <w:tcMar>
+              <w:top w:type="dxa" w:w="100"/>
+              <w:left w:type="dxa" w:w="140"/>
+              <w:bottom w:type="dxa" w:w="100"/>
+              <w:right w:type="dxa" w:w="140"/>
+            </w:tcMar>
+          </w:tcPr>
+          <w:p>
+            <w:r>
+              <w:rPr>
+                <w:b w:val="false"/>
+                <w:bCs w:val="false"/>
+                <w:color w:val="1A2B3C"/>
+                <w:sz w:val="21"/>
+                <w:szCs w:val="21"/>
+              </w:rPr>
+              <w:t xml:space="preserve">Use Cohen’s kappa to measure agreement between preliminary FTIR results and confirmed lab substances.</w:t>
+            </w:r>
+          </w:p>
+        </w:tc>
+        <w:tc>
+          <w:tcPr>
+            <w:tcW w:type="dxa" w:w="3160"/>
+            <w:tcBorders>
+              <w:top w:val="single" w:color="D0D8E0" w:sz="6"/>
+              <w:left w:val="single" w:color="D0D8E0" w:sz="6"/>
+              <w:bottom w:val="single" w:color="D0D8E0" w:sz="6"/>
+              <w:right w:val="single" w:color="D0D8E0" w:sz="6"/>
+            </w:tcBorders>
+            <w:shd w:fill="FFFFFF" w:color="auto" w:val="clear"/>
+            <w:tcMar>
+              <w:top w:type="dxa" w:w="100"/>
+              <w:left w:type="dxa" w:w="140"/>
+              <w:bottom w:type="dxa" w:w="100"/>
+              <w:right w:type="dxa" w:w="140"/>
+            </w:tcMar>
+          </w:tcPr>
+          <w:p>
+            <w:r>
+              <w:rPr>
+                <w:b w:val="false"/>
+                <w:bCs w:val="false"/>
+                <w:color w:val="1A2B3C"/>
+                <w:sz w:val="21"/>
+                <w:szCs w:val="21"/>
+              </w:rPr>
+              <w:t xml:space="preserve">“Compute Cohen’s kappa between preliminary_ftir_substances and confirmed_lab_substances for fentanyl”</w:t>
+            </w:r>
+          </w:p>
+        </w:tc>
+      </w:tr>
+      <w:tr>
+        <w:tc>
+          <w:tcPr>
+            <w:tcW w:type="dxa" w:w="2400"/>
+            <w:tcBorders>
+              <w:top w:val="single" w:color="D0D8E0" w:sz="6"/>
+              <w:left w:val="single" w:color="D0D8E0" w:sz="6"/>
+              <w:bottom w:val="single" w:color="D0D8E0" w:sz="6"/>
+              <w:right w:val="single" w:color="D0D8E0" w:sz="6"/>
+            </w:tcBorders>
+            <w:shd w:fill="E6F4F3" w:color="auto" w:val="clear"/>
+            <w:tcMar>
+              <w:top w:type="dxa" w:w="100"/>
+              <w:left w:type="dxa" w:w="140"/>
+              <w:bottom w:type="dxa" w:w="100"/>
+              <w:right w:type="dxa" w:w="140"/>
+            </w:tcMar>
+          </w:tcPr>
+          <w:p>
+            <w:r>
+              <w:rPr>
+                <w:b/>
+                <w:bCs/>
+                <w:color w:val="1A2B3C"/>
+                <w:sz w:val="21"/>
+                <w:szCs w:val="21"/>
+              </w:rPr>
+              <w:t xml:space="preserve">Confidence intervals</w:t>
+            </w:r>
+          </w:p>
+        </w:tc>
+        <w:tc>
+          <w:tcPr>
+            <w:tcW w:type="dxa" w:w="3800"/>
+            <w:tcBorders>
+              <w:top w:val="single" w:color="D0D8E0" w:sz="6"/>
+              <w:left w:val="single" w:color="D0D8E0" w:sz="6"/>
+              <w:bottom w:val="single" w:color="D0D8E0" w:sz="6"/>
+              <w:right w:val="single" w:color="D0D8E0" w:sz="6"/>
+            </w:tcBorders>
+            <w:shd w:fill="E6F4F3" w:color="auto" w:val="clear"/>
+            <w:tcMar>
+              <w:top w:type="dxa" w:w="100"/>
+              <w:left w:type="dxa" w:w="140"/>
+              <w:bottom w:type="dxa" w:w="100"/>
+              <w:right w:type="dxa" w:w="140"/>
+            </w:tcMar>
+          </w:tcPr>
+          <w:p>
+            <w:r>
+              <w:rPr>
+                <w:b w:val="false"/>
+                <w:bCs w:val="false"/>
+                <w:color w:val="1A2B3C"/>
+                <w:sz w:val="21"/>
+                <w:szCs w:val="21"/>
+              </w:rPr>
+              <w:t xml:space="preserve">Get a 95% confidence interval around any percentage so you know how precise your estimate is.</w:t>
+            </w:r>
+          </w:p>
+        </w:tc>
+        <w:tc>
+          <w:tcPr>
+            <w:tcW w:type="dxa" w:w="3160"/>
+            <w:tcBorders>
+              <w:top w:val="single" w:color="D0D8E0" w:sz="6"/>
+              <w:left w:val="single" w:color="D0D8E0" w:sz="6"/>
+              <w:bottom w:val="single" w:color="D0D8E0" w:sz="6"/>
+              <w:right w:val="single" w:color="D0D8E0" w:sz="6"/>
+            </w:tcBorders>
+            <w:shd w:fill="E6F4F3" w:color="auto" w:val="clear"/>
+            <w:tcMar>
+              <w:top w:type="dxa" w:w="100"/>
+              <w:left w:type="dxa" w:w="140"/>
+              <w:bottom w:type="dxa" w:w="100"/>
+              <w:right w:type="dxa" w:w="140"/>
+            </w:tcMar>
+          </w:tcPr>
+          <w:p>
+            <w:r>
+              <w:rPr>
+                <w:b w:val="false"/>
+                <w:bCs w:val="false"/>
+                <w:color w:val="1A2B3C"/>
+                <w:sz w:val="21"/>
+                <w:szCs w:val="21"/>
+              </w:rPr>
+              <w:t xml:space="preserve">“95% confidence interval for the percent of cocaine samples that also contained fentanyl in 2024”</w:t>
+            </w:r>
+          </w:p>
+        </w:tc>
+      </w:tr>
+    </w:tbl>
+    <w:p>
+      <w:pPr>
+        <w:pBdr>
+          <w:left w:val="single" w:color="00857A" w:sz="24" w:space="12"/>
+        </w:pBdr>
+        <w:spacing w:after="200" w:before="100" w:line="300"/>
+        <w:ind w:left="240"/>
+      </w:pPr>
+      <w:r>
+        <w:rPr>
+          <w:b/>
+          <w:bCs/>
+          <w:color w:val="00857A"/>
+          <w:sz w:val="22"/>
+          <w:szCs w:val="22"/>
+        </w:rPr>
+        <w:t xml:space="preserve">Reading the result: </w:t>
+      </w:r>
+      <w:r>
+        <w:rPr>
+          <w:color w:val="1A2B3C"/>
+          <w:sz w:val="22"/>
+          <w:szCs w:val="22"/>
+        </w:rPr>
+        <w:t xml:space="preserve">The tool will return the test statistic, the p-value, and a plain-English interpretation. As a rule of thumb, p &lt; 0.05 suggests the pattern is unlikely to be random — but always sanity-check sample sizes before drawing conclusions.</w:t>
       </w:r>
     </w:p>
     <w:p>
@@ -2116,7 +4158,7 @@
     <w:next w:val="Normal"/>
     <w:qFormat/>
     <w:pPr>
-      <w:spacing w:after="180" w:before="240"/>
+      <w:spacing w:after="180" w:before="360"/>
       <w:outlineLvl w:val="0"/>
     </w:pPr>
     <w:rPr>
@@ -2134,7 +4176,7 @@
     <w:next w:val="Normal"/>
     <w:qFormat/>
     <w:pPr>
-      <w:spacing w:after="160" w:before="360"/>
+      <w:spacing w:after="140" w:before="280"/>
       <w:outlineLvl w:val="1"/>
     </w:pPr>
     <w:rPr>
@@ -2142,8 +4184,8 @@
       <w:b/>
       <w:bCs/>
       <w:color w:val="00857A"/>
-      <w:sz w:val="28"/>
-      <w:szCs w:val="28"/>
+      <w:sz w:val="26"/>
+      <w:szCs w:val="26"/>
     </w:rPr>
   </w:style>
 </w:styles>

</xml_diff>